<commit_message>
feat : ajout d'une autre serie fonctionne -> au cas où la nouvelle série comprend les dates communes -> celles de la nouvelle série sont prises en compte
</commit_message>
<xml_diff>
--- a/docs/rapport/R-I323-KirilBormin.docx
+++ b/docs/rapport/R-I323-KirilBormin.docx
@@ -3683,6 +3683,26 @@
     </w:p>
     <w:p>
       <w:pPr>
+        <w:pStyle w:val="Retraitcorpsdetexte"/>
+      </w:pPr>
+      <w:r>
+        <w:t xml:space="preserve">Dans la planification initiale, je n’ai pas pris en compte que le lundi de la semaine </w:t>
+      </w:r>
+      <w:r>
+        <w:t xml:space="preserve"> </w:t>
+      </w:r>
+      <w:r>
+        <w:t xml:space="preserve">5 est congé, et qu’il faillait rien planifier pour ce </w:t>
+      </w:r>
+      <w:r>
+        <w:t>jour-là</w:t>
+      </w:r>
+      <w:r>
+        <w:t>.</w:t>
+      </w:r>
+    </w:p>
+    <w:p>
+      <w:pPr>
         <w:pStyle w:val="Informations"/>
         <w:numPr>
           <w:ilvl w:val="5"/>
@@ -3922,6 +3942,7 @@
         </w:numPr>
       </w:pPr>
       <w:r>
+        <w:lastRenderedPageBreak/>
         <w:t>Q</w:t>
       </w:r>
       <w:r>
@@ -3979,7 +4000,6 @@
         </w:numPr>
       </w:pPr>
       <w:r>
-        <w:lastRenderedPageBreak/>
         <w:t>Suite à donner, améliorations souhaitables, …</w:t>
       </w:r>
     </w:p>
@@ -4507,7 +4527,7 @@
               <w:noProof/>
               <w:szCs w:val="16"/>
             </w:rPr>
-            <w:t>31.08.2026 11:18</w:t>
+            <w:t>07.09.2026 10:48</w:t>
           </w:r>
           <w:r>
             <w:rPr>
@@ -10154,15 +10174,6 @@
 </file>
 
 <file path=customXml/item1.xml><?xml version="1.0" encoding="utf-8"?>
-<?mso-contentType ?>
-<FormTemplates xmlns="http://schemas.microsoft.com/sharepoint/v3/contenttype/forms">
-  <Display>DocumentLibraryForm</Display>
-  <Edit>DocumentLibraryForm</Edit>
-  <New>DocumentLibraryForm</New>
-</FormTemplates>
-</file>
-
-<file path=customXml/item2.xml><?xml version="1.0" encoding="utf-8"?>
 <p:properties xmlns:p="http://schemas.microsoft.com/office/2006/metadata/properties" xmlns:xsi="http://www.w3.org/2001/XMLSchema-instance" xmlns:pc="http://schemas.microsoft.com/office/infopath/2007/PartnerControls">
   <documentManagement>
     <lcf76f155ced4ddcb4097134ff3c332f xmlns="a1b10758-7132-46a4-a2fe-7a2cf46f51f4">
@@ -10173,11 +10184,16 @@
 </p:properties>
 </file>
 
-<file path=customXml/item3.xml><?xml version="1.0" encoding="utf-8"?>
-<b:Sources xmlns:b="http://schemas.openxmlformats.org/officeDocument/2006/bibliography" xmlns="http://schemas.openxmlformats.org/officeDocument/2006/bibliography" SelectedStyle="\APA.XSL" StyleName="APA"/>
+<file path=customXml/item2.xml><?xml version="1.0" encoding="utf-8"?>
+<?mso-contentType ?>
+<FormTemplates xmlns="http://schemas.microsoft.com/sharepoint/v3/contenttype/forms">
+  <Display>DocumentLibraryForm</Display>
+  <Edit>DocumentLibraryForm</Edit>
+  <New>DocumentLibraryForm</New>
+</FormTemplates>
 </file>
 
-<file path=customXml/item4.xml><?xml version="1.0" encoding="utf-8"?>
+<file path=customXml/item3.xml><?xml version="1.0" encoding="utf-8"?>
 <ct:contentTypeSchema xmlns:ct="http://schemas.microsoft.com/office/2006/metadata/contentType" xmlns:ma="http://schemas.microsoft.com/office/2006/metadata/properties/metaAttributes" ct:_="" ma:_="" ma:contentTypeName="Document" ma:contentTypeID="0x0101005A5B8F5EAAC22C48A11F5D9A60E6F21D" ma:contentTypeVersion="16" ma:contentTypeDescription="Crée un document." ma:contentTypeScope="" ma:versionID="f2b963976306cc54294b7f4545a3c6c4">
   <xsd:schema xmlns:xsd="http://www.w3.org/2001/XMLSchema" xmlns:xs="http://www.w3.org/2001/XMLSchema" xmlns:p="http://schemas.microsoft.com/office/2006/metadata/properties" xmlns:ns2="a1b10758-7132-46a4-a2fe-7a2cf46f51f4" xmlns:ns3="f7d9f5a6-831d-4621-8c77-cbcaf993e406" targetNamespace="http://schemas.microsoft.com/office/2006/metadata/properties" ma:root="true" ma:fieldsID="e5e135fa2fc1295e1586ddcd9c1a8904" ns2:_="" ns3:_="">
     <xsd:import namespace="a1b10758-7132-46a4-a2fe-7a2cf46f51f4"/>
@@ -10420,15 +10436,11 @@
 </ct:contentTypeSchema>
 </file>
 
-<file path=customXml/itemProps1.xml><?xml version="1.0" encoding="utf-8"?>
-<ds:datastoreItem xmlns:ds="http://schemas.openxmlformats.org/officeDocument/2006/customXml" ds:itemID="{5E865F57-6285-4B13-9F81-ABD3A2DB1ADD}">
-  <ds:schemaRefs>
-    <ds:schemaRef ds:uri="http://schemas.microsoft.com/sharepoint/v3/contenttype/forms"/>
-  </ds:schemaRefs>
-</ds:datastoreItem>
+<file path=customXml/item4.xml><?xml version="1.0" encoding="utf-8"?>
+<b:Sources xmlns:b="http://schemas.openxmlformats.org/officeDocument/2006/bibliography" xmlns="http://schemas.openxmlformats.org/officeDocument/2006/bibliography" SelectedStyle="\APA.XSL" StyleName="APA"/>
 </file>
 
-<file path=customXml/itemProps2.xml><?xml version="1.0" encoding="utf-8"?>
+<file path=customXml/itemProps1.xml><?xml version="1.0" encoding="utf-8"?>
 <ds:datastoreItem xmlns:ds="http://schemas.openxmlformats.org/officeDocument/2006/customXml" ds:itemID="{24954833-9F05-49C5-955F-86E47D037F04}">
   <ds:schemaRefs>
     <ds:schemaRef ds:uri="http://schemas.microsoft.com/office/2006/metadata/properties"/>
@@ -10439,15 +10451,15 @@
 </ds:datastoreItem>
 </file>
 
-<file path=customXml/itemProps3.xml><?xml version="1.0" encoding="utf-8"?>
-<ds:datastoreItem xmlns:ds="http://schemas.openxmlformats.org/officeDocument/2006/customXml" ds:itemID="{CC7784B4-F310-4DC4-8DFD-79BD564D2FFE}">
+<file path=customXml/itemProps2.xml><?xml version="1.0" encoding="utf-8"?>
+<ds:datastoreItem xmlns:ds="http://schemas.openxmlformats.org/officeDocument/2006/customXml" ds:itemID="{5E865F57-6285-4B13-9F81-ABD3A2DB1ADD}">
   <ds:schemaRefs>
-    <ds:schemaRef ds:uri="http://schemas.openxmlformats.org/officeDocument/2006/bibliography"/>
+    <ds:schemaRef ds:uri="http://schemas.microsoft.com/sharepoint/v3/contenttype/forms"/>
   </ds:schemaRefs>
 </ds:datastoreItem>
 </file>
 
-<file path=customXml/itemProps4.xml><?xml version="1.0" encoding="utf-8"?>
+<file path=customXml/itemProps3.xml><?xml version="1.0" encoding="utf-8"?>
 <ds:datastoreItem xmlns:ds="http://schemas.openxmlformats.org/officeDocument/2006/customXml" ds:itemID="{C9A788E4-007D-401C-881B-2F70B33A007D}">
   <ds:schemaRefs>
     <ds:schemaRef ds:uri="http://schemas.microsoft.com/office/2006/metadata/contentType"/>
@@ -10464,4 +10476,12 @@
     <ds:schemaRef ds:uri="http://schemas.microsoft.com/internal/obd"/>
   </ds:schemaRefs>
 </ds:datastoreItem>
+</file>
+
+<file path=customXml/itemProps4.xml><?xml version="1.0" encoding="utf-8"?>
+<ds:datastoreItem xmlns:ds="http://schemas.openxmlformats.org/officeDocument/2006/customXml" ds:itemID="{CC7784B4-F310-4DC4-8DFD-79BD564D2FFE}">
+  <ds:schemaRefs>
+    <ds:schemaRef ds:uri="http://schemas.openxmlformats.org/officeDocument/2006/bibliography"/>
+  </ds:schemaRefs>
+</ds:datastoreItem>
 </file>
</xml_diff>

<commit_message>
docs : màj rapport, livraison finale
</commit_message>
<xml_diff>
--- a/docs/rapport/R-I323-KirilBormin.docx
+++ b/docs/rapport/R-I323-KirilBormin.docx
@@ -193,7 +193,7 @@
         </w:rPr>
         <w:fldChar w:fldCharType="separate"/>
       </w:r>
-      <w:hyperlink w:anchor="_Toc244079140" w:history="1">
+      <w:hyperlink w:anchor="_Toc244164406" w:history="1">
         <w:r>
           <w:rPr>
             <w:rStyle w:val="Lienhypertexte"/>
@@ -241,7 +241,7 @@
             <w:noProof/>
             <w:webHidden/>
           </w:rPr>
-          <w:instrText xml:space="preserve"> PAGEREF _Toc244079140 \h </w:instrText>
+          <w:instrText xml:space="preserve"> PAGEREF _Toc244164406 \h </w:instrText>
         </w:r>
         <w:r>
           <w:rPr>
@@ -289,7 +289,7 @@
           <w14:ligatures w14:val="standardContextual"/>
         </w:rPr>
       </w:pPr>
-      <w:hyperlink w:anchor="_Toc244079141" w:history="1">
+      <w:hyperlink w:anchor="_Toc244164407" w:history="1">
         <w:r>
           <w:rPr>
             <w:rStyle w:val="Lienhypertexte"/>
@@ -335,7 +335,7 @@
             <w:noProof/>
             <w:webHidden/>
           </w:rPr>
-          <w:instrText xml:space="preserve"> PAGEREF _Toc244079141 \h </w:instrText>
+          <w:instrText xml:space="preserve"> PAGEREF _Toc244164407 \h </w:instrText>
         </w:r>
         <w:r>
           <w:rPr>
@@ -383,7 +383,7 @@
           <w14:ligatures w14:val="standardContextual"/>
         </w:rPr>
       </w:pPr>
-      <w:hyperlink w:anchor="_Toc244079142" w:history="1">
+      <w:hyperlink w:anchor="_Toc244164408" w:history="1">
         <w:r>
           <w:rPr>
             <w:rStyle w:val="Lienhypertexte"/>
@@ -429,7 +429,7 @@
             <w:noProof/>
             <w:webHidden/>
           </w:rPr>
-          <w:instrText xml:space="preserve"> PAGEREF _Toc244079142 \h </w:instrText>
+          <w:instrText xml:space="preserve"> PAGEREF _Toc244164408 \h </w:instrText>
         </w:r>
         <w:r>
           <w:rPr>
@@ -477,7 +477,7 @@
           <w14:ligatures w14:val="standardContextual"/>
         </w:rPr>
       </w:pPr>
-      <w:hyperlink w:anchor="_Toc244079143" w:history="1">
+      <w:hyperlink w:anchor="_Toc244164409" w:history="1">
         <w:r>
           <w:rPr>
             <w:rStyle w:val="Lienhypertexte"/>
@@ -523,7 +523,7 @@
             <w:noProof/>
             <w:webHidden/>
           </w:rPr>
-          <w:instrText xml:space="preserve"> PAGEREF _Toc244079143 \h </w:instrText>
+          <w:instrText xml:space="preserve"> PAGEREF _Toc244164409 \h </w:instrText>
         </w:r>
         <w:r>
           <w:rPr>
@@ -571,7 +571,7 @@
           <w14:ligatures w14:val="standardContextual"/>
         </w:rPr>
       </w:pPr>
-      <w:hyperlink w:anchor="_Toc244079144" w:history="1">
+      <w:hyperlink w:anchor="_Toc244164410" w:history="1">
         <w:r>
           <w:rPr>
             <w:rStyle w:val="Lienhypertexte"/>
@@ -617,7 +617,7 @@
             <w:noProof/>
             <w:webHidden/>
           </w:rPr>
-          <w:instrText xml:space="preserve"> PAGEREF _Toc244079144 \h </w:instrText>
+          <w:instrText xml:space="preserve"> PAGEREF _Toc244164410 \h </w:instrText>
         </w:r>
         <w:r>
           <w:rPr>
@@ -667,7 +667,7 @@
           <w14:ligatures w14:val="standardContextual"/>
         </w:rPr>
       </w:pPr>
-      <w:hyperlink w:anchor="_Toc244079145" w:history="1">
+      <w:hyperlink w:anchor="_Toc244164411" w:history="1">
         <w:r>
           <w:rPr>
             <w:rStyle w:val="Lienhypertexte"/>
@@ -715,7 +715,7 @@
             <w:noProof/>
             <w:webHidden/>
           </w:rPr>
-          <w:instrText xml:space="preserve"> PAGEREF _Toc244079145 \h </w:instrText>
+          <w:instrText xml:space="preserve"> PAGEREF _Toc244164411 \h </w:instrText>
         </w:r>
         <w:r>
           <w:rPr>
@@ -763,7 +763,7 @@
           <w14:ligatures w14:val="standardContextual"/>
         </w:rPr>
       </w:pPr>
-      <w:hyperlink w:anchor="_Toc244079146" w:history="1">
+      <w:hyperlink w:anchor="_Toc244164412" w:history="1">
         <w:r>
           <w:rPr>
             <w:rStyle w:val="Lienhypertexte"/>
@@ -809,7 +809,7 @@
             <w:noProof/>
             <w:webHidden/>
           </w:rPr>
-          <w:instrText xml:space="preserve"> PAGEREF _Toc244079146 \h </w:instrText>
+          <w:instrText xml:space="preserve"> PAGEREF _Toc244164412 \h </w:instrText>
         </w:r>
         <w:r>
           <w:rPr>
@@ -859,7 +859,7 @@
           <w14:ligatures w14:val="standardContextual"/>
         </w:rPr>
       </w:pPr>
-      <w:hyperlink w:anchor="_Toc244079147" w:history="1">
+      <w:hyperlink w:anchor="_Toc244164413" w:history="1">
         <w:r>
           <w:rPr>
             <w:rStyle w:val="Lienhypertexte"/>
@@ -907,7 +907,7 @@
             <w:noProof/>
             <w:webHidden/>
           </w:rPr>
-          <w:instrText xml:space="preserve"> PAGEREF _Toc244079147 \h </w:instrText>
+          <w:instrText xml:space="preserve"> PAGEREF _Toc244164413 \h </w:instrText>
         </w:r>
         <w:r>
           <w:rPr>
@@ -955,7 +955,7 @@
           <w14:ligatures w14:val="standardContextual"/>
         </w:rPr>
       </w:pPr>
-      <w:hyperlink w:anchor="_Toc244079148" w:history="1">
+      <w:hyperlink w:anchor="_Toc244164414" w:history="1">
         <w:r>
           <w:rPr>
             <w:rStyle w:val="Lienhypertexte"/>
@@ -1001,7 +1001,7 @@
             <w:noProof/>
             <w:webHidden/>
           </w:rPr>
-          <w:instrText xml:space="preserve"> PAGEREF _Toc244079148 \h </w:instrText>
+          <w:instrText xml:space="preserve"> PAGEREF _Toc244164414 \h </w:instrText>
         </w:r>
         <w:r>
           <w:rPr>
@@ -1049,7 +1049,7 @@
           <w14:ligatures w14:val="standardContextual"/>
         </w:rPr>
       </w:pPr>
-      <w:hyperlink w:anchor="_Toc244079149" w:history="1">
+      <w:hyperlink w:anchor="_Toc244164415" w:history="1">
         <w:r>
           <w:rPr>
             <w:rStyle w:val="Lienhypertexte"/>
@@ -1095,7 +1095,7 @@
             <w:noProof/>
             <w:webHidden/>
           </w:rPr>
-          <w:instrText xml:space="preserve"> PAGEREF _Toc244079149 \h </w:instrText>
+          <w:instrText xml:space="preserve"> PAGEREF _Toc244164415 \h </w:instrText>
         </w:r>
         <w:r>
           <w:rPr>
@@ -1143,7 +1143,7 @@
           <w14:ligatures w14:val="standardContextual"/>
         </w:rPr>
       </w:pPr>
-      <w:hyperlink w:anchor="_Toc244079150" w:history="1">
+      <w:hyperlink w:anchor="_Toc244164416" w:history="1">
         <w:r>
           <w:rPr>
             <w:rStyle w:val="Lienhypertexte"/>
@@ -1189,7 +1189,7 @@
             <w:noProof/>
             <w:webHidden/>
           </w:rPr>
-          <w:instrText xml:space="preserve"> PAGEREF _Toc244079150 \h </w:instrText>
+          <w:instrText xml:space="preserve"> PAGEREF _Toc244164416 \h </w:instrText>
         </w:r>
         <w:r>
           <w:rPr>
@@ -1237,7 +1237,7 @@
           <w14:ligatures w14:val="standardContextual"/>
         </w:rPr>
       </w:pPr>
-      <w:hyperlink w:anchor="_Toc244079151" w:history="1">
+      <w:hyperlink w:anchor="_Toc244164417" w:history="1">
         <w:r>
           <w:rPr>
             <w:rStyle w:val="Lienhypertexte"/>
@@ -1283,7 +1283,7 @@
             <w:noProof/>
             <w:webHidden/>
           </w:rPr>
-          <w:instrText xml:space="preserve"> PAGEREF _Toc244079151 \h </w:instrText>
+          <w:instrText xml:space="preserve"> PAGEREF _Toc244164417 \h </w:instrText>
         </w:r>
         <w:r>
           <w:rPr>
@@ -1331,7 +1331,7 @@
           <w14:ligatures w14:val="standardContextual"/>
         </w:rPr>
       </w:pPr>
-      <w:hyperlink w:anchor="_Toc244079152" w:history="1">
+      <w:hyperlink w:anchor="_Toc244164418" w:history="1">
         <w:r>
           <w:rPr>
             <w:rStyle w:val="Lienhypertexte"/>
@@ -1377,7 +1377,7 @@
             <w:noProof/>
             <w:webHidden/>
           </w:rPr>
-          <w:instrText xml:space="preserve"> PAGEREF _Toc244079152 \h </w:instrText>
+          <w:instrText xml:space="preserve"> PAGEREF _Toc244164418 \h </w:instrText>
         </w:r>
         <w:r>
           <w:rPr>
@@ -1425,7 +1425,7 @@
           <w14:ligatures w14:val="standardContextual"/>
         </w:rPr>
       </w:pPr>
-      <w:hyperlink w:anchor="_Toc244079153" w:history="1">
+      <w:hyperlink w:anchor="_Toc244164419" w:history="1">
         <w:r>
           <w:rPr>
             <w:rStyle w:val="Lienhypertexte"/>
@@ -1471,7 +1471,7 @@
             <w:noProof/>
             <w:webHidden/>
           </w:rPr>
-          <w:instrText xml:space="preserve"> PAGEREF _Toc244079153 \h </w:instrText>
+          <w:instrText xml:space="preserve"> PAGEREF _Toc244164419 \h </w:instrText>
         </w:r>
         <w:r>
           <w:rPr>
@@ -1519,7 +1519,7 @@
           <w14:ligatures w14:val="standardContextual"/>
         </w:rPr>
       </w:pPr>
-      <w:hyperlink w:anchor="_Toc244079154" w:history="1">
+      <w:hyperlink w:anchor="_Toc244164420" w:history="1">
         <w:r>
           <w:rPr>
             <w:rStyle w:val="Lienhypertexte"/>
@@ -1565,7 +1565,7 @@
             <w:noProof/>
             <w:webHidden/>
           </w:rPr>
-          <w:instrText xml:space="preserve"> PAGEREF _Toc244079154 \h </w:instrText>
+          <w:instrText xml:space="preserve"> PAGEREF _Toc244164420 \h </w:instrText>
         </w:r>
         <w:r>
           <w:rPr>
@@ -1615,7 +1615,7 @@
           <w14:ligatures w14:val="standardContextual"/>
         </w:rPr>
       </w:pPr>
-      <w:hyperlink w:anchor="_Toc244079155" w:history="1">
+      <w:hyperlink w:anchor="_Toc244164421" w:history="1">
         <w:r>
           <w:rPr>
             <w:rStyle w:val="Lienhypertexte"/>
@@ -1663,7 +1663,7 @@
             <w:noProof/>
             <w:webHidden/>
           </w:rPr>
-          <w:instrText xml:space="preserve"> PAGEREF _Toc244079155 \h </w:instrText>
+          <w:instrText xml:space="preserve"> PAGEREF _Toc244164421 \h </w:instrText>
         </w:r>
         <w:r>
           <w:rPr>
@@ -1711,7 +1711,7 @@
           <w14:ligatures w14:val="standardContextual"/>
         </w:rPr>
       </w:pPr>
-      <w:hyperlink w:anchor="_Toc244079156" w:history="1">
+      <w:hyperlink w:anchor="_Toc244164422" w:history="1">
         <w:r>
           <w:rPr>
             <w:rStyle w:val="Lienhypertexte"/>
@@ -1757,7 +1757,7 @@
             <w:noProof/>
             <w:webHidden/>
           </w:rPr>
-          <w:instrText xml:space="preserve"> PAGEREF _Toc244079156 \h </w:instrText>
+          <w:instrText xml:space="preserve"> PAGEREF _Toc244164422 \h </w:instrText>
         </w:r>
         <w:r>
           <w:rPr>
@@ -1805,7 +1805,7 @@
           <w14:ligatures w14:val="standardContextual"/>
         </w:rPr>
       </w:pPr>
-      <w:hyperlink w:anchor="_Toc244079157" w:history="1">
+      <w:hyperlink w:anchor="_Toc244164423" w:history="1">
         <w:r>
           <w:rPr>
             <w:rStyle w:val="Lienhypertexte"/>
@@ -1851,7 +1851,101 @@
             <w:noProof/>
             <w:webHidden/>
           </w:rPr>
-          <w:instrText xml:space="preserve"> PAGEREF _Toc244079157 \h </w:instrText>
+          <w:instrText xml:space="preserve"> PAGEREF _Toc244164423 \h </w:instrText>
+        </w:r>
+        <w:r>
+          <w:rPr>
+            <w:noProof/>
+            <w:webHidden/>
+          </w:rPr>
+        </w:r>
+        <w:r>
+          <w:rPr>
+            <w:noProof/>
+            <w:webHidden/>
+          </w:rPr>
+          <w:fldChar w:fldCharType="separate"/>
+        </w:r>
+        <w:r>
+          <w:rPr>
+            <w:noProof/>
+            <w:webHidden/>
+          </w:rPr>
+          <w:t>9</w:t>
+        </w:r>
+        <w:r>
+          <w:rPr>
+            <w:noProof/>
+            <w:webHidden/>
+          </w:rPr>
+          <w:fldChar w:fldCharType="end"/>
+        </w:r>
+      </w:hyperlink>
+    </w:p>
+    <w:p>
+      <w:pPr>
+        <w:pStyle w:val="TM2"/>
+        <w:tabs>
+          <w:tab w:val="left" w:pos="800"/>
+          <w:tab w:val="right" w:leader="dot" w:pos="9060"/>
+        </w:tabs>
+        <w:rPr>
+          <w:rFonts w:eastAsiaTheme="minorEastAsia" w:cstheme="minorBidi"/>
+          <w:smallCaps w:val="0"/>
+          <w:noProof/>
+          <w:kern w:val="2"/>
+          <w:sz w:val="24"/>
+          <w:szCs w:val="24"/>
+          <w14:ligatures w14:val="standardContextual"/>
+        </w:rPr>
+      </w:pPr>
+      <w:hyperlink w:anchor="_Toc244164424" w:history="1">
+        <w:r>
+          <w:rPr>
+            <w:rStyle w:val="Lienhypertexte"/>
+            <w:noProof/>
+          </w:rPr>
+          <w:t>4.3</w:t>
+        </w:r>
+        <w:r>
+          <w:rPr>
+            <w:rFonts w:eastAsiaTheme="minorEastAsia" w:cstheme="minorBidi"/>
+            <w:smallCaps w:val="0"/>
+            <w:noProof/>
+            <w:kern w:val="2"/>
+            <w:sz w:val="24"/>
+            <w:szCs w:val="24"/>
+            <w14:ligatures w14:val="standardContextual"/>
+          </w:rPr>
+          <w:tab/>
+        </w:r>
+        <w:r>
+          <w:rPr>
+            <w:rStyle w:val="Lienhypertexte"/>
+            <w:noProof/>
+          </w:rPr>
+          <w:t>Formatage des grands nombres</w:t>
+        </w:r>
+        <w:r>
+          <w:rPr>
+            <w:noProof/>
+            <w:webHidden/>
+          </w:rPr>
+          <w:tab/>
+        </w:r>
+        <w:r>
+          <w:rPr>
+            <w:noProof/>
+            <w:webHidden/>
+          </w:rPr>
+          <w:fldChar w:fldCharType="begin"/>
+        </w:r>
+        <w:r>
+          <w:rPr>
+            <w:noProof/>
+            <w:webHidden/>
+          </w:rPr>
+          <w:instrText xml:space="preserve"> PAGEREF _Toc244164424 \h </w:instrText>
         </w:r>
         <w:r>
           <w:rPr>
@@ -1901,7 +1995,7 @@
           <w14:ligatures w14:val="standardContextual"/>
         </w:rPr>
       </w:pPr>
-      <w:hyperlink w:anchor="_Toc244079158" w:history="1">
+      <w:hyperlink w:anchor="_Toc244164425" w:history="1">
         <w:r>
           <w:rPr>
             <w:rStyle w:val="Lienhypertexte"/>
@@ -1949,7 +2043,7 @@
             <w:noProof/>
             <w:webHidden/>
           </w:rPr>
-          <w:instrText xml:space="preserve"> PAGEREF _Toc244079158 \h </w:instrText>
+          <w:instrText xml:space="preserve"> PAGEREF _Toc244164425 \h </w:instrText>
         </w:r>
         <w:r>
           <w:rPr>
@@ -1997,7 +2091,7 @@
           <w14:ligatures w14:val="standardContextual"/>
         </w:rPr>
       </w:pPr>
-      <w:hyperlink w:anchor="_Toc244079159" w:history="1">
+      <w:hyperlink w:anchor="_Toc244164426" w:history="1">
         <w:r>
           <w:rPr>
             <w:rStyle w:val="Lienhypertexte"/>
@@ -2043,7 +2137,7 @@
             <w:noProof/>
             <w:webHidden/>
           </w:rPr>
-          <w:instrText xml:space="preserve"> PAGEREF _Toc244079159 \h </w:instrText>
+          <w:instrText xml:space="preserve"> PAGEREF _Toc244164426 \h </w:instrText>
         </w:r>
         <w:r>
           <w:rPr>
@@ -2091,7 +2185,7 @@
           <w14:ligatures w14:val="standardContextual"/>
         </w:rPr>
       </w:pPr>
-      <w:hyperlink w:anchor="_Toc244079160" w:history="1">
+      <w:hyperlink w:anchor="_Toc244164427" w:history="1">
         <w:r>
           <w:rPr>
             <w:rStyle w:val="Lienhypertexte"/>
@@ -2137,7 +2231,7 @@
             <w:noProof/>
             <w:webHidden/>
           </w:rPr>
-          <w:instrText xml:space="preserve"> PAGEREF _Toc244079160 \h </w:instrText>
+          <w:instrText xml:space="preserve"> PAGEREF _Toc244164427 \h </w:instrText>
         </w:r>
         <w:r>
           <w:rPr>
@@ -2157,7 +2251,7 @@
             <w:noProof/>
             <w:webHidden/>
           </w:rPr>
-          <w:t>9</w:t>
+          <w:t>10</w:t>
         </w:r>
         <w:r>
           <w:rPr>
@@ -2185,7 +2279,7 @@
           <w14:ligatures w14:val="standardContextual"/>
         </w:rPr>
       </w:pPr>
-      <w:hyperlink w:anchor="_Toc244079161" w:history="1">
+      <w:hyperlink w:anchor="_Toc244164428" w:history="1">
         <w:r>
           <w:rPr>
             <w:rStyle w:val="Lienhypertexte"/>
@@ -2231,7 +2325,7 @@
             <w:noProof/>
             <w:webHidden/>
           </w:rPr>
-          <w:instrText xml:space="preserve"> PAGEREF _Toc244079161 \h </w:instrText>
+          <w:instrText xml:space="preserve"> PAGEREF _Toc244164428 \h </w:instrText>
         </w:r>
         <w:r>
           <w:rPr>
@@ -2251,7 +2345,7 @@
             <w:noProof/>
             <w:webHidden/>
           </w:rPr>
-          <w:t>9</w:t>
+          <w:t>10</w:t>
         </w:r>
         <w:r>
           <w:rPr>
@@ -2279,7 +2373,7 @@
           <w14:ligatures w14:val="standardContextual"/>
         </w:rPr>
       </w:pPr>
-      <w:hyperlink w:anchor="_Toc244079162" w:history="1">
+      <w:hyperlink w:anchor="_Toc244164429" w:history="1">
         <w:r>
           <w:rPr>
             <w:rStyle w:val="Lienhypertexte"/>
@@ -2325,7 +2419,7 @@
             <w:noProof/>
             <w:webHidden/>
           </w:rPr>
-          <w:instrText xml:space="preserve"> PAGEREF _Toc244079162 \h </w:instrText>
+          <w:instrText xml:space="preserve"> PAGEREF _Toc244164429 \h </w:instrText>
         </w:r>
         <w:r>
           <w:rPr>
@@ -2345,7 +2439,7 @@
             <w:noProof/>
             <w:webHidden/>
           </w:rPr>
-          <w:t>9</w:t>
+          <w:t>10</w:t>
         </w:r>
         <w:r>
           <w:rPr>
@@ -2375,7 +2469,7 @@
           <w14:ligatures w14:val="standardContextual"/>
         </w:rPr>
       </w:pPr>
-      <w:hyperlink w:anchor="_Toc244079163" w:history="1">
+      <w:hyperlink w:anchor="_Toc244164430" w:history="1">
         <w:r>
           <w:rPr>
             <w:rStyle w:val="Lienhypertexte"/>
@@ -2423,7 +2517,7 @@
             <w:noProof/>
             <w:webHidden/>
           </w:rPr>
-          <w:instrText xml:space="preserve"> PAGEREF _Toc244079163 \h </w:instrText>
+          <w:instrText xml:space="preserve"> PAGEREF _Toc244164430 \h </w:instrText>
         </w:r>
         <w:r>
           <w:rPr>
@@ -2473,7 +2567,7 @@
           <w14:ligatures w14:val="standardContextual"/>
         </w:rPr>
       </w:pPr>
-      <w:hyperlink w:anchor="_Toc244079164" w:history="1">
+      <w:hyperlink w:anchor="_Toc244164431" w:history="1">
         <w:r>
           <w:rPr>
             <w:rStyle w:val="Lienhypertexte"/>
@@ -2521,7 +2615,7 @@
             <w:noProof/>
             <w:webHidden/>
           </w:rPr>
-          <w:instrText xml:space="preserve"> PAGEREF _Toc244079164 \h </w:instrText>
+          <w:instrText xml:space="preserve"> PAGEREF _Toc244164431 \h </w:instrText>
         </w:r>
         <w:r>
           <w:rPr>
@@ -2541,7 +2635,7 @@
             <w:noProof/>
             <w:webHidden/>
           </w:rPr>
-          <w:t>11</w:t>
+          <w:t>12</w:t>
         </w:r>
         <w:r>
           <w:rPr>
@@ -2569,7 +2663,7 @@
           <w14:ligatures w14:val="standardContextual"/>
         </w:rPr>
       </w:pPr>
-      <w:hyperlink w:anchor="_Toc244079165" w:history="1">
+      <w:hyperlink w:anchor="_Toc244164432" w:history="1">
         <w:r>
           <w:rPr>
             <w:rStyle w:val="Lienhypertexte"/>
@@ -2615,7 +2709,7 @@
             <w:noProof/>
             <w:webHidden/>
           </w:rPr>
-          <w:instrText xml:space="preserve"> PAGEREF _Toc244079165 \h </w:instrText>
+          <w:instrText xml:space="preserve"> PAGEREF _Toc244164432 \h </w:instrText>
         </w:r>
         <w:r>
           <w:rPr>
@@ -2635,7 +2729,7 @@
             <w:noProof/>
             <w:webHidden/>
           </w:rPr>
-          <w:t>11</w:t>
+          <w:t>12</w:t>
         </w:r>
         <w:r>
           <w:rPr>
@@ -2663,7 +2757,7 @@
           <w14:ligatures w14:val="standardContextual"/>
         </w:rPr>
       </w:pPr>
-      <w:hyperlink w:anchor="_Toc244079166" w:history="1">
+      <w:hyperlink w:anchor="_Toc244164433" w:history="1">
         <w:r>
           <w:rPr>
             <w:rStyle w:val="Lienhypertexte"/>
@@ -2709,7 +2803,7 @@
             <w:noProof/>
             <w:webHidden/>
           </w:rPr>
-          <w:instrText xml:space="preserve"> PAGEREF _Toc244079166 \h </w:instrText>
+          <w:instrText xml:space="preserve"> PAGEREF _Toc244164433 \h </w:instrText>
         </w:r>
         <w:r>
           <w:rPr>
@@ -2729,7 +2823,7 @@
             <w:noProof/>
             <w:webHidden/>
           </w:rPr>
-          <w:t>11</w:t>
+          <w:t>12</w:t>
         </w:r>
         <w:r>
           <w:rPr>
@@ -2757,7 +2851,7 @@
           <w14:ligatures w14:val="standardContextual"/>
         </w:rPr>
       </w:pPr>
-      <w:hyperlink w:anchor="_Toc244079167" w:history="1">
+      <w:hyperlink w:anchor="_Toc244164434" w:history="1">
         <w:r>
           <w:rPr>
             <w:rStyle w:val="Lienhypertexte"/>
@@ -2803,7 +2897,7 @@
             <w:noProof/>
             <w:webHidden/>
           </w:rPr>
-          <w:instrText xml:space="preserve"> PAGEREF _Toc244079167 \h </w:instrText>
+          <w:instrText xml:space="preserve"> PAGEREF _Toc244164434 \h </w:instrText>
         </w:r>
         <w:r>
           <w:rPr>
@@ -2823,7 +2917,7 @@
             <w:noProof/>
             <w:webHidden/>
           </w:rPr>
-          <w:t>12</w:t>
+          <w:t>13</w:t>
         </w:r>
         <w:r>
           <w:rPr>
@@ -2851,7 +2945,7 @@
           <w14:ligatures w14:val="standardContextual"/>
         </w:rPr>
       </w:pPr>
-      <w:hyperlink w:anchor="_Toc244079168" w:history="1">
+      <w:hyperlink w:anchor="_Toc244164435" w:history="1">
         <w:r>
           <w:rPr>
             <w:rStyle w:val="Lienhypertexte"/>
@@ -2897,7 +2991,7 @@
             <w:noProof/>
             <w:webHidden/>
           </w:rPr>
-          <w:instrText xml:space="preserve"> PAGEREF _Toc244079168 \h </w:instrText>
+          <w:instrText xml:space="preserve"> PAGEREF _Toc244164435 \h </w:instrText>
         </w:r>
         <w:r>
           <w:rPr>
@@ -2917,7 +3011,7 @@
             <w:noProof/>
             <w:webHidden/>
           </w:rPr>
-          <w:t>12</w:t>
+          <w:t>13</w:t>
         </w:r>
         <w:r>
           <w:rPr>
@@ -2947,7 +3041,7 @@
           <w14:ligatures w14:val="standardContextual"/>
         </w:rPr>
       </w:pPr>
-      <w:hyperlink w:anchor="_Toc244079169" w:history="1">
+      <w:hyperlink w:anchor="_Toc244164436" w:history="1">
         <w:r>
           <w:rPr>
             <w:rStyle w:val="Lienhypertexte"/>
@@ -2995,7 +3089,7 @@
             <w:noProof/>
             <w:webHidden/>
           </w:rPr>
-          <w:instrText xml:space="preserve"> PAGEREF _Toc244079169 \h </w:instrText>
+          <w:instrText xml:space="preserve"> PAGEREF _Toc244164436 \h </w:instrText>
         </w:r>
         <w:r>
           <w:rPr>
@@ -3015,7 +3109,7 @@
             <w:noProof/>
             <w:webHidden/>
           </w:rPr>
-          <w:t>12</w:t>
+          <w:t>13</w:t>
         </w:r>
         <w:r>
           <w:rPr>
@@ -3048,7 +3142,7 @@
       </w:pPr>
       <w:bookmarkStart w:id="0" w:name="_Toc532179955"/>
       <w:bookmarkStart w:id="1" w:name="_Toc165969637"/>
-      <w:bookmarkStart w:id="2" w:name="_Toc244079140"/>
+      <w:bookmarkStart w:id="2" w:name="_Toc244164406"/>
       <w:r>
         <w:lastRenderedPageBreak/>
         <w:t>Spécifications</w:t>
@@ -3063,7 +3157,7 @@
       </w:pPr>
       <w:bookmarkStart w:id="3" w:name="_Toc532179969"/>
       <w:bookmarkStart w:id="4" w:name="_Toc165969639"/>
-      <w:bookmarkStart w:id="5" w:name="_Toc244079141"/>
+      <w:bookmarkStart w:id="5" w:name="_Toc244164407"/>
       <w:r>
         <w:t>T</w:t>
       </w:r>
@@ -3086,6 +3180,7 @@
           <w:szCs w:val="32"/>
         </w:rPr>
       </w:pPr>
+      <w:proofErr w:type="spellStart"/>
       <w:r>
         <w:rPr>
           <w:rStyle w:val="lev"/>
@@ -3096,12 +3191,13 @@
         </w:rPr>
         <w:t>PlotThoseLines</w:t>
       </w:r>
+      <w:proofErr w:type="spellEnd"/>
     </w:p>
     <w:p>
       <w:pPr>
         <w:pStyle w:val="Titre2"/>
       </w:pPr>
-      <w:bookmarkStart w:id="6" w:name="_Toc244079142"/>
+      <w:bookmarkStart w:id="6" w:name="_Toc244164408"/>
       <w:r>
         <w:t>Description</w:t>
       </w:r>
@@ -3118,7 +3214,15 @@
         <w:t xml:space="preserve"> (séries de données dans le temps)</w:t>
       </w:r>
       <w:r>
-        <w:t>. L’utilisateur peut utiliser 2 sources de données : json et csv</w:t>
+        <w:t xml:space="preserve">. L’utilisateur peut utiliser 2 sources de données : </w:t>
+      </w:r>
+      <w:proofErr w:type="spellStart"/>
+      <w:r>
+        <w:t>json</w:t>
+      </w:r>
+      <w:proofErr w:type="spellEnd"/>
+      <w:r>
+        <w:t xml:space="preserve"> et csv</w:t>
       </w:r>
       <w:r>
         <w:t>.</w:t>
@@ -3128,7 +3232,7 @@
       <w:pPr>
         <w:pStyle w:val="Titre2"/>
       </w:pPr>
-      <w:bookmarkStart w:id="7" w:name="_Toc244079143"/>
+      <w:bookmarkStart w:id="7" w:name="_Toc244164409"/>
       <w:r>
         <w:t>Domaine et source de données</w:t>
       </w:r>
@@ -3178,9 +3282,11 @@
           <w:numId w:val="8"/>
         </w:numPr>
       </w:pPr>
+      <w:proofErr w:type="spellStart"/>
       <w:r>
         <w:t>Nvidia</w:t>
       </w:r>
+      <w:proofErr w:type="spellEnd"/>
     </w:p>
     <w:p>
       <w:pPr>
@@ -3296,7 +3402,15 @@
         <w:t xml:space="preserve"> –</w:t>
       </w:r>
       <w:r>
-        <w:t xml:space="preserve"> Fichiers .csv ou json exporté depuis Yahoo Finance</w:t>
+        <w:t xml:space="preserve"> Fichiers .csv ou </w:t>
+      </w:r>
+      <w:proofErr w:type="spellStart"/>
+      <w:r>
+        <w:t>json</w:t>
+      </w:r>
+      <w:proofErr w:type="spellEnd"/>
+      <w:r>
+        <w:t xml:space="preserve"> exporté depuis Yahoo Finance</w:t>
       </w:r>
       <w:r>
         <w:t xml:space="preserve"> </w:t>
@@ -3317,7 +3431,7 @@
       <w:pPr>
         <w:pStyle w:val="Titre2"/>
       </w:pPr>
-      <w:bookmarkStart w:id="8" w:name="_Toc244079144"/>
+      <w:bookmarkStart w:id="8" w:name="_Toc244164410"/>
       <w:r>
         <w:t>Objectifs</w:t>
       </w:r>
@@ -3335,7 +3449,15 @@
         <w:t>Objectif produit</w:t>
       </w:r>
       <w:r>
-        <w:t xml:space="preserve"> : Créer une application simple et rapide pour importer des données, les enregistrer en stockage local pour travailler hors ligne, et afficher plusieurs courbes en même temps à l’aide de la librairie ScottPlot. </w:t>
+        <w:t xml:space="preserve"> : Créer une application simple et rapide pour importer des données, les enregistrer en stockage local pour travailler hors ligne, et afficher plusieurs courbes en même temps à l’aide de la librairie </w:t>
+      </w:r>
+      <w:proofErr w:type="spellStart"/>
+      <w:r>
+        <w:t>ScottPlot</w:t>
+      </w:r>
+      <w:proofErr w:type="spellEnd"/>
+      <w:r>
+        <w:t xml:space="preserve">. </w:t>
       </w:r>
     </w:p>
     <w:p>
@@ -3380,7 +3502,7 @@
       <w:pPr>
         <w:pStyle w:val="Titre1"/>
       </w:pPr>
-      <w:bookmarkStart w:id="9" w:name="_Toc244079145"/>
+      <w:bookmarkStart w:id="9" w:name="_Toc244164411"/>
       <w:r>
         <w:t>Planification</w:t>
       </w:r>
@@ -3395,7 +3517,7 @@
       <w:pPr>
         <w:pStyle w:val="Titre2"/>
       </w:pPr>
-      <w:bookmarkStart w:id="10" w:name="_Toc244079146"/>
+      <w:bookmarkStart w:id="10" w:name="_Toc244164412"/>
       <w:r>
         <w:t>Planification initiale</w:t>
       </w:r>
@@ -3497,8 +3619,13 @@
               <w:ind w:left="0"/>
             </w:pPr>
             <w:r>
-              <w:t>Intégration de la librairie ScottPlot</w:t>
+              <w:t xml:space="preserve">Intégration de la librairie </w:t>
             </w:r>
+            <w:proofErr w:type="spellStart"/>
+            <w:r>
+              <w:t>ScottPlot</w:t>
+            </w:r>
+            <w:proofErr w:type="spellEnd"/>
           </w:p>
         </w:tc>
       </w:tr>
@@ -3527,8 +3654,13 @@
               <w:ind w:left="0"/>
             </w:pPr>
             <w:r>
-              <w:t>Intégration de la librairie ScottPlot</w:t>
+              <w:t xml:space="preserve">Intégration de la librairie </w:t>
             </w:r>
+            <w:proofErr w:type="spellStart"/>
+            <w:r>
+              <w:t>ScottPlot</w:t>
+            </w:r>
+            <w:proofErr w:type="spellEnd"/>
           </w:p>
         </w:tc>
       </w:tr>
@@ -3642,7 +3774,7 @@
       <w:pPr>
         <w:pStyle w:val="Titre1"/>
       </w:pPr>
-      <w:bookmarkStart w:id="11" w:name="_Toc244079147"/>
+      <w:bookmarkStart w:id="11" w:name="_Toc244164413"/>
       <w:r>
         <w:t>Analyse fonctionnel</w:t>
       </w:r>
@@ -3658,9 +3790,17 @@
       <w:pPr>
         <w:pStyle w:val="Titre2"/>
       </w:pPr>
-      <w:bookmarkStart w:id="12" w:name="_Toc244079148"/>
-      <w:r>
-        <w:t>#1 — Ajout d'une nouvelle serie depuis un fichier</w:t>
+      <w:bookmarkStart w:id="12" w:name="_Toc244164414"/>
+      <w:r>
+        <w:t xml:space="preserve">#1 — Ajout d'une nouvelle </w:t>
+      </w:r>
+      <w:proofErr w:type="spellStart"/>
+      <w:r>
+        <w:t>serie</w:t>
+      </w:r>
+      <w:proofErr w:type="spellEnd"/>
+      <w:r>
+        <w:t xml:space="preserve"> depuis un fichier</w:t>
       </w:r>
       <w:bookmarkEnd w:id="12"/>
     </w:p>
@@ -3670,7 +3810,20 @@
       </w:r>
       <w:r>
         <w:br/>
-        <w:t>Je veux importer un fichier de données local (.csv, .json),</w:t>
+        <w:t>Je veux importer un fichier de données local (.csv</w:t>
+      </w:r>
+      <w:proofErr w:type="gramStart"/>
+      <w:r>
+        <w:t>, .</w:t>
+      </w:r>
+      <w:proofErr w:type="spellStart"/>
+      <w:r>
+        <w:t>json</w:t>
+      </w:r>
+      <w:proofErr w:type="spellEnd"/>
+      <w:proofErr w:type="gramEnd"/>
+      <w:r>
+        <w:t>),</w:t>
       </w:r>
       <w:r>
         <w:br/>
@@ -3698,7 +3851,20 @@
         </w:numPr>
       </w:pPr>
       <w:r>
-        <w:t xml:space="preserve">Sélection : Une boîte de dialogue d'exploration de fichiers s'ouvre avec un filtre prédéfini sur les extensions .csv et .json. </w:t>
+        <w:t xml:space="preserve">Sélection : Une boîte de dialogue d'exploration de fichiers s'ouvre avec un filtre prédéfini sur les extensions .csv </w:t>
+      </w:r>
+      <w:proofErr w:type="gramStart"/>
+      <w:r>
+        <w:t>et .</w:t>
+      </w:r>
+      <w:proofErr w:type="spellStart"/>
+      <w:r>
+        <w:t>json</w:t>
+      </w:r>
+      <w:proofErr w:type="spellEnd"/>
+      <w:proofErr w:type="gramEnd"/>
+      <w:r>
+        <w:t xml:space="preserve">. </w:t>
       </w:r>
     </w:p>
     <w:p>
@@ -3709,7 +3875,15 @@
         </w:numPr>
       </w:pPr>
       <w:r>
-        <w:t>Succès : Le fichier est lu et les données sont enregistrées dans le stockage local -&gt; La nouvelle série s'ajoute automatiquement à la liste des graphiques cochables à gauche.</w:t>
+        <w:t xml:space="preserve">Succès : Le fichier est lu et les données sont enregistrées dans le stockage local -&gt; La nouvelle série s'ajoute automatiquement à la liste des graphiques </w:t>
+      </w:r>
+      <w:proofErr w:type="spellStart"/>
+      <w:r>
+        <w:t>cochables</w:t>
+      </w:r>
+      <w:proofErr w:type="spellEnd"/>
+      <w:r>
+        <w:t xml:space="preserve"> à gauche.</w:t>
       </w:r>
     </w:p>
     <w:p>
@@ -3776,7 +3950,7 @@
       <w:pPr>
         <w:pStyle w:val="Titre2"/>
       </w:pPr>
-      <w:bookmarkStart w:id="13" w:name="_Toc244079149"/>
+      <w:bookmarkStart w:id="13" w:name="_Toc244164415"/>
       <w:r>
         <w:t>#2 — Masquer une série</w:t>
       </w:r>
@@ -3789,7 +3963,15 @@
     </w:p>
     <w:p>
       <w:r>
-        <w:t>Je veux pouvoir masquer une serie de la vue active,</w:t>
+        <w:t xml:space="preserve">Je veux pouvoir masquer une </w:t>
+      </w:r>
+      <w:proofErr w:type="spellStart"/>
+      <w:r>
+        <w:t>serie</w:t>
+      </w:r>
+      <w:proofErr w:type="spellEnd"/>
+      <w:r>
+        <w:t xml:space="preserve"> de la vue active,</w:t>
       </w:r>
     </w:p>
     <w:p>
@@ -3800,7 +3982,15 @@
     <w:p/>
     <w:p>
       <w:r>
-        <w:t>•   Une liste cochable de suppression retire une courbe du graphique immédiatement.</w:t>
+        <w:t xml:space="preserve">•   Une liste </w:t>
+      </w:r>
+      <w:proofErr w:type="spellStart"/>
+      <w:r>
+        <w:t>cochable</w:t>
+      </w:r>
+      <w:proofErr w:type="spellEnd"/>
+      <w:r>
+        <w:t xml:space="preserve"> de suppression retire une courbe du graphique immédiatement.</w:t>
       </w:r>
     </w:p>
     <w:p/>
@@ -3857,7 +4047,7 @@
       <w:pPr>
         <w:pStyle w:val="Titre2"/>
       </w:pPr>
-      <w:bookmarkStart w:id="14" w:name="_Toc244079150"/>
+      <w:bookmarkStart w:id="14" w:name="_Toc244164416"/>
       <w:r>
         <w:t>#3 — Interaction avec le graphique</w:t>
       </w:r>
@@ -3947,7 +4137,7 @@
       <w:pPr>
         <w:pStyle w:val="Titre2"/>
       </w:pPr>
-      <w:bookmarkStart w:id="15" w:name="_Toc244079151"/>
+      <w:bookmarkStart w:id="15" w:name="_Toc244164417"/>
       <w:r>
         <w:lastRenderedPageBreak/>
         <w:t>#4 — Labels des graphiques</w:t>
@@ -3977,7 +4167,15 @@
     </w:p>
     <w:p>
       <w:r>
-        <w:t>•   Afficher ou masquer une série -&gt;  La légende actualise instantanément le nom et la pastille de couleur correspondante.</w:t>
+        <w:t>•   Afficher ou masquer une série -</w:t>
+      </w:r>
+      <w:proofErr w:type="gramStart"/>
+      <w:r>
+        <w:t>&gt;  La</w:t>
+      </w:r>
+      <w:proofErr w:type="gramEnd"/>
+      <w:r>
+        <w:t xml:space="preserve"> légende actualise instantanément le nom et la pastille de couleur correspondante.</w:t>
       </w:r>
     </w:p>
     <w:p/>
@@ -4033,7 +4231,7 @@
       <w:pPr>
         <w:pStyle w:val="Titre2"/>
       </w:pPr>
-      <w:bookmarkStart w:id="16" w:name="_Toc244079152"/>
+      <w:bookmarkStart w:id="16" w:name="_Toc244164418"/>
       <w:r>
         <w:t>#5 — Ajout de jeu de données depuis une API</w:t>
       </w:r>
@@ -4127,7 +4325,7 @@
       <w:pPr>
         <w:pStyle w:val="Titre2"/>
       </w:pPr>
-      <w:bookmarkStart w:id="17" w:name="_Toc244079153"/>
+      <w:bookmarkStart w:id="17" w:name="_Toc244164419"/>
       <w:r>
         <w:t>#6 — Saisie manuelle d'un nouveau point</w:t>
       </w:r>
@@ -4259,7 +4457,7 @@
       <w:pPr>
         <w:pStyle w:val="Titre2"/>
       </w:pPr>
-      <w:bookmarkStart w:id="18" w:name="_Toc244079154"/>
+      <w:bookmarkStart w:id="18" w:name="_Toc244164420"/>
       <w:r>
         <w:t>#7 — Exportation en PNG</w:t>
       </w:r>
@@ -4360,7 +4558,7 @@
       <w:pPr>
         <w:pStyle w:val="Titre1"/>
       </w:pPr>
-      <w:bookmarkStart w:id="19" w:name="_Toc244079155"/>
+      <w:bookmarkStart w:id="19" w:name="_Toc244164421"/>
       <w:r>
         <w:lastRenderedPageBreak/>
         <w:t>Points techniques</w:t>
@@ -4371,9 +4569,14 @@
       <w:pPr>
         <w:pStyle w:val="Titre2"/>
       </w:pPr>
-      <w:bookmarkStart w:id="20" w:name="_Toc244079156"/>
-      <w:r>
-        <w:t>Parser des csv</w:t>
+      <w:bookmarkStart w:id="20" w:name="_Toc244164422"/>
+      <w:proofErr w:type="spellStart"/>
+      <w:r>
+        <w:t>Parser</w:t>
+      </w:r>
+      <w:proofErr w:type="spellEnd"/>
+      <w:r>
+        <w:t xml:space="preserve"> des csv</w:t>
       </w:r>
       <w:bookmarkEnd w:id="20"/>
     </w:p>
@@ -4382,8 +4585,13 @@
         <w:pStyle w:val="Retraitcorpsdetexte"/>
       </w:pPr>
       <w:r>
-        <w:t>Pour extraire les données des fichiers CSV sans alourdir l'interface, la logique a été déplacée dans une classe dédiée Parser.cs</w:t>
-      </w:r>
+        <w:t xml:space="preserve">Pour extraire les données des fichiers CSV sans alourdir l'interface, la logique a été déplacée dans une classe dédiée </w:t>
+      </w:r>
+      <w:proofErr w:type="spellStart"/>
+      <w:r>
+        <w:t>Parser.cs</w:t>
+      </w:r>
+      <w:proofErr w:type="spellEnd"/>
     </w:p>
     <w:p>
       <w:pPr>
@@ -4395,14 +4603,22 @@
         <w:pStyle w:val="Retraitcorpsdetexte"/>
       </w:pPr>
       <w:r>
-        <w:t>Ce parseur utilise des méthodes LINQ à la place de boucles foreach. Il recherche automatiquement les colonnes de date et de valeur grâce à une liste d'alias possibles Si une colonne manque ou si le fichier est vide, une exception) est levée pour informer l'utilisateur sans faire planter le programme.</w:t>
+        <w:t xml:space="preserve">Ce parseur utilise des méthodes LINQ à la place de boucles </w:t>
+      </w:r>
+      <w:proofErr w:type="spellStart"/>
+      <w:r>
+        <w:t>foreach</w:t>
+      </w:r>
+      <w:proofErr w:type="spellEnd"/>
+      <w:r>
+        <w:t>. Il recherche automatiquement les colonnes de date et de valeur grâce à une liste d'alias possibles Si une colonne manque ou si le fichier est vide, une exception est levée pour informer l'utilisateur sans faire planter le programme.</w:t>
       </w:r>
     </w:p>
     <w:p>
       <w:pPr>
         <w:pStyle w:val="Titre2"/>
       </w:pPr>
-      <w:bookmarkStart w:id="21" w:name="_Toc244079157"/>
+      <w:bookmarkStart w:id="21" w:name="_Toc244164423"/>
       <w:r>
         <w:t>Fusion des séries</w:t>
       </w:r>
@@ -4413,7 +4629,21 @@
         <w:pStyle w:val="Retraitcorpsdetexte"/>
       </w:pPr>
       <w:r>
-        <w:t xml:space="preserve">Également pour la logique de fusion de d’ancienne série avec une nouvelle, j’ai créé une classe séparée SeriesMerge.cs. </w:t>
+        <w:t>Également pour la logique de fusion d’</w:t>
+      </w:r>
+      <w:r>
+        <w:t xml:space="preserve">une </w:t>
+      </w:r>
+      <w:r>
+        <w:t xml:space="preserve">ancienne série avec une nouvelle, j’ai créé une classe séparée </w:t>
+      </w:r>
+      <w:proofErr w:type="spellStart"/>
+      <w:r>
+        <w:t>SeriesMerge.cs</w:t>
+      </w:r>
+      <w:proofErr w:type="spellEnd"/>
+      <w:r>
+        <w:t xml:space="preserve">. </w:t>
       </w:r>
     </w:p>
     <w:p>
@@ -4435,55 +4665,183 @@
         <w:t>les anciens points</w:t>
       </w:r>
       <w:r>
-        <w:t xml:space="preserve"> de ce période et les remplacer par les nouveaux. </w:t>
-      </w:r>
-    </w:p>
-    <w:p>
-      <w:pPr>
-        <w:pStyle w:val="Informations"/>
-      </w:pPr>
+        <w:t xml:space="preserve"> de ce</w:t>
+      </w:r>
+      <w:r>
+        <w:t>tte</w:t>
+      </w:r>
+      <w:r>
+        <w:t xml:space="preserve"> période et les remplacer par les nouveaux. </w:t>
+      </w:r>
+    </w:p>
+    <w:p>
+      <w:pPr>
+        <w:pStyle w:val="Titre2"/>
+      </w:pPr>
+      <w:bookmarkStart w:id="22" w:name="_Toc244164424"/>
+      <w:r>
+        <w:t>Formatage des grands nombres</w:t>
+      </w:r>
+      <w:bookmarkEnd w:id="22"/>
+      <w:r>
+        <w:t xml:space="preserve"> </w:t>
+      </w:r>
+    </w:p>
+    <w:p>
+      <w:pPr>
+        <w:pStyle w:val="Retraitcorpsdetexte"/>
+      </w:pPr>
+      <w:r>
+        <w:t xml:space="preserve">Comme la capitalisation boursière des grandes entreprises dépasse souvent le milliard ou le billion de dollars, les nombres sur l'axe Y étaient trop longs à lire (par </w:t>
+      </w:r>
+      <w:r>
+        <w:t>ex. :</w:t>
+      </w:r>
+      <w:r>
+        <w:t xml:space="preserve"> 3 000 000 000 000). J'ai donc créé la classe </w:t>
+      </w:r>
+      <w:proofErr w:type="spellStart"/>
+      <w:r>
+        <w:t>NumberFormatter</w:t>
+      </w:r>
+      <w:proofErr w:type="spellEnd"/>
+      <w:r>
+        <w:t xml:space="preserve"> pour transformer ces grands nombres en texte plus court avec des lettres : M pour les millions, Md pour les milliards et T pour les trillions. Cette méthode est reliée directement à l'axe gauche du graphique </w:t>
+      </w:r>
+      <w:proofErr w:type="spellStart"/>
+      <w:r>
+        <w:t>ScottPlot</w:t>
+      </w:r>
+      <w:proofErr w:type="spellEnd"/>
+      <w:r>
+        <w:t xml:space="preserve"> grâce à l'option </w:t>
+      </w:r>
+      <w:proofErr w:type="spellStart"/>
+      <w:r>
+        <w:t>LabelFormatter</w:t>
+      </w:r>
+      <w:proofErr w:type="spellEnd"/>
+      <w:r>
+        <w:t>.</w:t>
+      </w:r>
     </w:p>
     <w:p>
       <w:pPr>
         <w:pStyle w:val="Titre1"/>
       </w:pPr>
-      <w:bookmarkStart w:id="22" w:name="_Toc532179966"/>
-      <w:bookmarkStart w:id="23" w:name="_Toc165969650"/>
-      <w:bookmarkStart w:id="24" w:name="_Toc244079158"/>
+      <w:bookmarkStart w:id="23" w:name="_Toc532179966"/>
+      <w:bookmarkStart w:id="24" w:name="_Toc165969650"/>
+      <w:bookmarkStart w:id="25" w:name="_Toc244164425"/>
       <w:r>
         <w:t>Tests</w:t>
       </w:r>
-      <w:bookmarkStart w:id="25" w:name="_Toc532179968"/>
-      <w:bookmarkStart w:id="26" w:name="_Toc165969652"/>
-      <w:bookmarkStart w:id="27" w:name="_Ref308525868"/>
-      <w:bookmarkEnd w:id="22"/>
+      <w:bookmarkStart w:id="26" w:name="_Toc532179968"/>
+      <w:bookmarkStart w:id="27" w:name="_Toc165969652"/>
+      <w:bookmarkStart w:id="28" w:name="_Ref308525868"/>
       <w:bookmarkEnd w:id="23"/>
       <w:bookmarkEnd w:id="24"/>
-    </w:p>
-    <w:p>
-      <w:pPr>
-        <w:pStyle w:val="Corpsdetexte"/>
-      </w:pPr>
+      <w:bookmarkEnd w:id="25"/>
     </w:p>
     <w:p>
       <w:pPr>
         <w:pStyle w:val="Titre2"/>
       </w:pPr>
-      <w:bookmarkStart w:id="28" w:name="_Toc244079159"/>
-      <w:bookmarkEnd w:id="25"/>
+      <w:bookmarkStart w:id="29" w:name="_Toc244164426"/>
       <w:bookmarkEnd w:id="26"/>
       <w:bookmarkEnd w:id="27"/>
+      <w:bookmarkEnd w:id="28"/>
       <w:r>
         <w:t>Stratégie et exécution</w:t>
       </w:r>
-      <w:bookmarkEnd w:id="28"/>
+      <w:bookmarkEnd w:id="29"/>
     </w:p>
     <w:p>
       <w:pPr>
         <w:pStyle w:val="Retraitcorpsdetexte"/>
       </w:pPr>
       <w:r>
-        <w:t>Les règles métier ont été extraites de MainForm.cs vers des classes de services testées avec MSTest dans le projet PlotThoseLines.Tests. L'ensemble de la suite compte 10 tests unitaires, tous validés avec succès</w:t>
+        <w:drawing>
+          <wp:anchor distT="0" distB="0" distL="114300" distR="114300" simplePos="0" relativeHeight="251658240" behindDoc="0" locked="0" layoutInCell="1" allowOverlap="1" wp14:anchorId="5316F0B1" wp14:editId="6C9B8FD6">
+            <wp:simplePos x="0" y="0"/>
+            <wp:positionH relativeFrom="margin">
+              <wp:align>right</wp:align>
+            </wp:positionH>
+            <wp:positionV relativeFrom="paragraph">
+              <wp:posOffset>577898</wp:posOffset>
+            </wp:positionV>
+            <wp:extent cx="5759450" cy="3197860"/>
+            <wp:effectExtent l="0" t="0" r="0" b="2540"/>
+            <wp:wrapSquare wrapText="bothSides"/>
+            <wp:docPr id="252151131" name="Image 1"/>
+            <wp:cNvGraphicFramePr>
+              <a:graphicFrameLocks xmlns:a="http://schemas.openxmlformats.org/drawingml/2006/main" noChangeAspect="1"/>
+            </wp:cNvGraphicFramePr>
+            <a:graphic xmlns:a="http://schemas.openxmlformats.org/drawingml/2006/main">
+              <a:graphicData uri="http://schemas.openxmlformats.org/drawingml/2006/picture">
+                <pic:pic xmlns:pic="http://schemas.openxmlformats.org/drawingml/2006/picture">
+                  <pic:nvPicPr>
+                    <pic:cNvPr id="252151131" name=""/>
+                    <pic:cNvPicPr/>
+                  </pic:nvPicPr>
+                  <pic:blipFill>
+                    <a:blip r:embed="rId20">
+                      <a:extLst>
+                        <a:ext uri="{28A0092B-C50C-407E-A947-70E740481C1C}">
+                          <a14:useLocalDpi xmlns:a14="http://schemas.microsoft.com/office/drawing/2010/main" val="0"/>
+                        </a:ext>
+                      </a:extLst>
+                    </a:blip>
+                    <a:stretch>
+                      <a:fillRect/>
+                    </a:stretch>
+                  </pic:blipFill>
+                  <pic:spPr>
+                    <a:xfrm>
+                      <a:off x="0" y="0"/>
+                      <a:ext cx="5759450" cy="3197860"/>
+                    </a:xfrm>
+                    <a:prstGeom prst="rect">
+                      <a:avLst/>
+                    </a:prstGeom>
+                  </pic:spPr>
+                </pic:pic>
+              </a:graphicData>
+            </a:graphic>
+          </wp:anchor>
+        </w:drawing>
+      </w:r>
+      <w:r>
+        <w:t xml:space="preserve">Les règles métier ont été extraites de </w:t>
+      </w:r>
+      <w:proofErr w:type="spellStart"/>
+      <w:r>
+        <w:t>MainForm.cs</w:t>
+      </w:r>
+      <w:proofErr w:type="spellEnd"/>
+      <w:r>
+        <w:t xml:space="preserve"> vers des classes de </w:t>
+      </w:r>
+      <w:r>
+        <w:t>tests</w:t>
+      </w:r>
+      <w:r>
+        <w:t xml:space="preserve"> avec </w:t>
+      </w:r>
+      <w:proofErr w:type="spellStart"/>
+      <w:r>
+        <w:t>MSTest</w:t>
+      </w:r>
+      <w:proofErr w:type="spellEnd"/>
+      <w:r>
+        <w:t xml:space="preserve"> dans le projet </w:t>
+      </w:r>
+      <w:proofErr w:type="spellStart"/>
+      <w:r>
+        <w:t>PlotThoseLines.Tests</w:t>
+      </w:r>
+      <w:proofErr w:type="spellEnd"/>
+      <w:r>
+        <w:t>. L'ensemble de la suite compte 10 tests unitaires, tous validés avec succès</w:t>
       </w:r>
       <w:r>
         <w:t>.</w:t>
@@ -4491,13 +4849,39 @@
     </w:p>
     <w:p>
       <w:pPr>
+        <w:pStyle w:val="Retraitcorpsdetexte"/>
+      </w:pPr>
+    </w:p>
+    <w:p>
+      <w:pPr>
+        <w:pStyle w:val="Retraitcorpsdetexte"/>
+      </w:pPr>
+    </w:p>
+    <w:p>
+      <w:pPr>
         <w:pStyle w:val="Titre2"/>
       </w:pPr>
-      <w:bookmarkStart w:id="29" w:name="_Toc244079160"/>
-      <w:r>
-        <w:t>Service Parser (ParserTests.cs) :</w:t>
-      </w:r>
-      <w:bookmarkEnd w:id="29"/>
+      <w:bookmarkStart w:id="30" w:name="_Toc244164427"/>
+      <w:r>
+        <w:t xml:space="preserve">Service </w:t>
+      </w:r>
+      <w:proofErr w:type="spellStart"/>
+      <w:r>
+        <w:t>Parser</w:t>
+      </w:r>
+      <w:proofErr w:type="spellEnd"/>
+      <w:r>
+        <w:t xml:space="preserve"> (</w:t>
+      </w:r>
+      <w:proofErr w:type="spellStart"/>
+      <w:r>
+        <w:t>ParserTests.cs</w:t>
+      </w:r>
+      <w:proofErr w:type="spellEnd"/>
+      <w:r>
+        <w:t>) :</w:t>
+      </w:r>
+      <w:bookmarkEnd w:id="30"/>
       <w:r>
         <w:t xml:space="preserve"> </w:t>
       </w:r>
@@ -4523,7 +4907,15 @@
         </w:numPr>
       </w:pPr>
       <w:r>
-        <w:t>Levée d'une InvalidDataException si le fichier ne contient aucune ligne de données.</w:t>
+        <w:t xml:space="preserve">Levée d'une </w:t>
+      </w:r>
+      <w:proofErr w:type="spellStart"/>
+      <w:r>
+        <w:t>InvalidDataException</w:t>
+      </w:r>
+      <w:proofErr w:type="spellEnd"/>
+      <w:r>
+        <w:t xml:space="preserve"> si le fichier ne contient aucune ligne de données.</w:t>
       </w:r>
     </w:p>
     <w:p>
@@ -4535,18 +4927,34 @@
         </w:numPr>
       </w:pPr>
       <w:r>
-        <w:t>Levée d'une InvalidDataException si la colonne de prix/capitalisation est absente.</w:t>
+        <w:t xml:space="preserve">Levée d'une </w:t>
+      </w:r>
+      <w:proofErr w:type="spellStart"/>
+      <w:r>
+        <w:t>InvalidDataException</w:t>
+      </w:r>
+      <w:proofErr w:type="spellEnd"/>
+      <w:r>
+        <w:t xml:space="preserve"> si la colonne de prix/capitalisation est absente.</w:t>
       </w:r>
     </w:p>
     <w:p>
       <w:pPr>
         <w:pStyle w:val="Titre2"/>
       </w:pPr>
-      <w:bookmarkStart w:id="30" w:name="_Toc244079161"/>
-      <w:r>
-        <w:t>Service de fusion (SeriesMergeTests.cs) :</w:t>
-      </w:r>
-      <w:bookmarkEnd w:id="30"/>
+      <w:bookmarkStart w:id="31" w:name="_Toc244164428"/>
+      <w:r>
+        <w:t>Service de fusion (</w:t>
+      </w:r>
+      <w:proofErr w:type="spellStart"/>
+      <w:r>
+        <w:t>SeriesMergeTests.cs</w:t>
+      </w:r>
+      <w:proofErr w:type="spellEnd"/>
+      <w:r>
+        <w:t>) :</w:t>
+      </w:r>
+      <w:bookmarkEnd w:id="31"/>
       <w:r>
         <w:t xml:space="preserve"> </w:t>
       </w:r>
@@ -4591,11 +4999,19 @@
       <w:pPr>
         <w:pStyle w:val="Titre2"/>
       </w:pPr>
-      <w:bookmarkStart w:id="31" w:name="_Toc244079162"/>
-      <w:r>
-        <w:t>Service de formatage (NumberTransformatorTests.cs) :</w:t>
-      </w:r>
-      <w:bookmarkEnd w:id="31"/>
+      <w:bookmarkStart w:id="32" w:name="_Toc244164429"/>
+      <w:r>
+        <w:t>Service de formatage (</w:t>
+      </w:r>
+      <w:proofErr w:type="spellStart"/>
+      <w:r>
+        <w:t>NumberTransformatorTests.cs</w:t>
+      </w:r>
+      <w:proofErr w:type="spellEnd"/>
+      <w:r>
+        <w:t>) :</w:t>
+      </w:r>
+      <w:bookmarkEnd w:id="32"/>
       <w:r>
         <w:t xml:space="preserve"> </w:t>
       </w:r>
@@ -4651,11 +5067,6 @@
     <w:p>
       <w:pPr>
         <w:pStyle w:val="Retraitcorpsdetexte"/>
-      </w:pPr>
-    </w:p>
-    <w:p>
-      <w:pPr>
-        <w:pStyle w:val="Retraitcorpsdetexte"/>
         <w:ind w:left="0"/>
       </w:pPr>
     </w:p>
@@ -4663,19 +5074,30 @@
       <w:pPr>
         <w:pStyle w:val="Titre1"/>
       </w:pPr>
-      <w:bookmarkStart w:id="32" w:name="_Toc244079163"/>
-      <w:r>
-        <w:lastRenderedPageBreak/>
+      <w:bookmarkStart w:id="33" w:name="_Toc244164430"/>
+      <w:r>
         <w:t>Usage de l’IA</w:t>
       </w:r>
-      <w:bookmarkEnd w:id="32"/>
+      <w:bookmarkEnd w:id="33"/>
     </w:p>
     <w:p>
       <w:pPr>
         <w:pStyle w:val="Corpsdetexte"/>
       </w:pPr>
       <w:r>
-        <w:t>Pour tester l'application avec des données réelles et massives, je n’ai pas trouvé de source fiable et gratuit, et alors j'ai utilisé une intelligence artificielle pour générer un script de scraping.</w:t>
+        <w:t xml:space="preserve">Pour tester l'application avec beaucoup de données (entre 4 000 et 5 000 valeurs par entreprise), je n'ai pas trouvé de site gratuit qui donne directement l'historique de la capitalisation boursière en fichier CSV. Sur Yahoo Finance, on peut seulement avoir le prix d'une action mais pas la capitalisation totale. J'ai donc demandé à l'IA de me créer un script en Node.js </w:t>
+      </w:r>
+      <w:r>
+        <w:t>en utilisant</w:t>
+      </w:r>
+      <w:r>
+        <w:t xml:space="preserve"> la librairie yahoo-finance2. Ce script récupère d'abord le nombre total d'actions de l'entreprise puis il télécharge le prix de l'action chaque jour sur 20 ans</w:t>
+      </w:r>
+      <w:r>
+        <w:t xml:space="preserve"> (dans mon cas)</w:t>
+      </w:r>
+      <w:r>
+        <w:t xml:space="preserve">. Enfin, il multiplie le prix du jour par le nombre d'actions pour calculer la capitalisation boursière et enregistre le résultat dans un fichier CSV. </w:t>
       </w:r>
     </w:p>
     <w:p>
@@ -4683,22 +5105,7 @@
         <w:pStyle w:val="Corpsdetexte"/>
       </w:pPr>
       <w:r>
-        <w:t>But</w:t>
-      </w:r>
-      <w:r>
-        <w:t xml:space="preserve"> : Récupérer 20 ans d'historique de capitalisation boursière pour les grandes entreprises technologiques (Apple, </w:t>
-      </w:r>
-      <w:r>
-        <w:t>Google</w:t>
-      </w:r>
-      <w:r>
-        <w:t>, etc.)</w:t>
-      </w:r>
-      <w:r>
-        <w:t xml:space="preserve"> à fin d’attendre le nombre de données minimal</w:t>
-      </w:r>
-      <w:r>
-        <w:t>.</w:t>
+        <w:t>J'ai aussi utilisé l'IA pour générer trois fichiers avec des données fictives entre 2025 et 2035 afin de tester la fusion des courbes.</w:t>
       </w:r>
     </w:p>
     <w:p>
@@ -4720,8 +5127,21 @@
       <w:r>
         <w:t xml:space="preserve">« </w:t>
       </w:r>
-      <w:r>
-        <w:t>comment trouver un csv avec les données de capitalisation des plus grands companies du monde ?</w:t>
+      <w:proofErr w:type="gramStart"/>
+      <w:r>
+        <w:t>comment</w:t>
+      </w:r>
+      <w:proofErr w:type="gramEnd"/>
+      <w:r>
+        <w:t xml:space="preserve"> trouver un csv avec les données de capitalisation des plus grands </w:t>
+      </w:r>
+      <w:proofErr w:type="spellStart"/>
+      <w:r>
+        <w:t>companies</w:t>
+      </w:r>
+      <w:proofErr w:type="spellEnd"/>
+      <w:r>
+        <w:t xml:space="preserve"> du monde ?</w:t>
       </w:r>
       <w:r>
         <w:t> »</w:t>
@@ -4736,20 +5156,43 @@
         </w:numPr>
       </w:pPr>
       <w:r>
-        <w:t xml:space="preserve">« crée moi un script en python qui permet de récupérer </w:t>
+        <w:t>« </w:t>
+      </w:r>
+      <w:proofErr w:type="gramStart"/>
+      <w:r>
+        <w:t>crée</w:t>
+      </w:r>
+      <w:proofErr w:type="gramEnd"/>
+      <w:r>
+        <w:t xml:space="preserve"> moi un script en python qui permet de récupérer </w:t>
       </w:r>
       <w:r>
         <w:t>l'historique sur des années</w:t>
       </w:r>
       <w:r>
-        <w:t xml:space="preserve"> avec la fréquance une fois par jour pour les 20 années</w:t>
-      </w:r>
-      <w:r>
-        <w:t xml:space="preserve"> en nodejs</w:t>
-      </w:r>
+        <w:t xml:space="preserve"> avec la </w:t>
+      </w:r>
+      <w:proofErr w:type="spellStart"/>
+      <w:r>
+        <w:t>fréquance</w:t>
+      </w:r>
+      <w:proofErr w:type="spellEnd"/>
+      <w:r>
+        <w:t xml:space="preserve"> une fois par jour pour les 20 années</w:t>
+      </w:r>
+      <w:r>
+        <w:t xml:space="preserve"> en </w:t>
+      </w:r>
+      <w:proofErr w:type="spellStart"/>
+      <w:proofErr w:type="gramStart"/>
+      <w:r>
+        <w:t>nodejs</w:t>
+      </w:r>
+      <w:proofErr w:type="spellEnd"/>
       <w:r>
         <w:t>»</w:t>
       </w:r>
+      <w:proofErr w:type="gramEnd"/>
     </w:p>
     <w:p>
       <w:pPr>
@@ -4761,12 +5204,14 @@
           <w:lang w:val="en-US"/>
         </w:rPr>
       </w:pPr>
+      <w:proofErr w:type="gramStart"/>
       <w:r>
         <w:rPr>
           <w:lang w:val="en-US"/>
         </w:rPr>
         <w:t>Code :</w:t>
       </w:r>
+      <w:proofErr w:type="gramEnd"/>
       <w:r>
         <w:rPr>
           <w:lang w:val="en-US"/>
@@ -4812,7 +5257,69 @@
           <w:szCs w:val="16"/>
           <w:lang w:val="en-US"/>
         </w:rPr>
-        <w:t>const YahooFinance = pkg.YahooFinance || pkg.default || pkg;</w:t>
+        <w:t xml:space="preserve">const </w:t>
+      </w:r>
+      <w:proofErr w:type="spellStart"/>
+      <w:r>
+        <w:rPr>
+          <w:rFonts w:ascii="Consolas" w:hAnsi="Consolas"/>
+          <w:sz w:val="16"/>
+          <w:szCs w:val="16"/>
+          <w:lang w:val="en-US"/>
+        </w:rPr>
+        <w:t>YahooFinance</w:t>
+      </w:r>
+      <w:proofErr w:type="spellEnd"/>
+      <w:r>
+        <w:rPr>
+          <w:rFonts w:ascii="Consolas" w:hAnsi="Consolas"/>
+          <w:sz w:val="16"/>
+          <w:szCs w:val="16"/>
+          <w:lang w:val="en-US"/>
+        </w:rPr>
+        <w:t xml:space="preserve"> = </w:t>
+      </w:r>
+      <w:proofErr w:type="spellStart"/>
+      <w:proofErr w:type="gramStart"/>
+      <w:r>
+        <w:rPr>
+          <w:rFonts w:ascii="Consolas" w:hAnsi="Consolas"/>
+          <w:sz w:val="16"/>
+          <w:szCs w:val="16"/>
+          <w:lang w:val="en-US"/>
+        </w:rPr>
+        <w:t>pkg.YahooFinance</w:t>
+      </w:r>
+      <w:proofErr w:type="spellEnd"/>
+      <w:proofErr w:type="gramEnd"/>
+      <w:r>
+        <w:rPr>
+          <w:rFonts w:ascii="Consolas" w:hAnsi="Consolas"/>
+          <w:sz w:val="16"/>
+          <w:szCs w:val="16"/>
+          <w:lang w:val="en-US"/>
+        </w:rPr>
+        <w:t xml:space="preserve"> || </w:t>
+      </w:r>
+      <w:proofErr w:type="spellStart"/>
+      <w:r>
+        <w:rPr>
+          <w:rFonts w:ascii="Consolas" w:hAnsi="Consolas"/>
+          <w:sz w:val="16"/>
+          <w:szCs w:val="16"/>
+          <w:lang w:val="en-US"/>
+        </w:rPr>
+        <w:t>pkg.default</w:t>
+      </w:r>
+      <w:proofErr w:type="spellEnd"/>
+      <w:r>
+        <w:rPr>
+          <w:rFonts w:ascii="Consolas" w:hAnsi="Consolas"/>
+          <w:sz w:val="16"/>
+          <w:szCs w:val="16"/>
+          <w:lang w:val="en-US"/>
+        </w:rPr>
+        <w:t xml:space="preserve"> || pkg;</w:t>
       </w:r>
     </w:p>
     <w:p>
@@ -4832,7 +5339,129 @@
           <w:szCs w:val="16"/>
           <w:lang w:val="en-US"/>
         </w:rPr>
-        <w:t>const yahooFinance = new YahooFinance({ suppressNotices: ['yahooSurvey', 'ripHistorical'] });</w:t>
+        <w:t xml:space="preserve">const </w:t>
+      </w:r>
+      <w:proofErr w:type="spellStart"/>
+      <w:r>
+        <w:rPr>
+          <w:rFonts w:ascii="Consolas" w:hAnsi="Consolas"/>
+          <w:sz w:val="16"/>
+          <w:szCs w:val="16"/>
+          <w:lang w:val="en-US"/>
+        </w:rPr>
+        <w:t>yahooFinance</w:t>
+      </w:r>
+      <w:proofErr w:type="spellEnd"/>
+      <w:r>
+        <w:rPr>
+          <w:rFonts w:ascii="Consolas" w:hAnsi="Consolas"/>
+          <w:sz w:val="16"/>
+          <w:szCs w:val="16"/>
+          <w:lang w:val="en-US"/>
+        </w:rPr>
+        <w:t xml:space="preserve"> = new </w:t>
+      </w:r>
+      <w:proofErr w:type="spellStart"/>
+      <w:proofErr w:type="gramStart"/>
+      <w:r>
+        <w:rPr>
+          <w:rFonts w:ascii="Consolas" w:hAnsi="Consolas"/>
+          <w:sz w:val="16"/>
+          <w:szCs w:val="16"/>
+          <w:lang w:val="en-US"/>
+        </w:rPr>
+        <w:t>YahooFinance</w:t>
+      </w:r>
+      <w:proofErr w:type="spellEnd"/>
+      <w:r>
+        <w:rPr>
+          <w:rFonts w:ascii="Consolas" w:hAnsi="Consolas"/>
+          <w:sz w:val="16"/>
+          <w:szCs w:val="16"/>
+          <w:lang w:val="en-US"/>
+        </w:rPr>
+        <w:t xml:space="preserve">({ </w:t>
+      </w:r>
+      <w:proofErr w:type="spellStart"/>
+      <w:r>
+        <w:rPr>
+          <w:rFonts w:ascii="Consolas" w:hAnsi="Consolas"/>
+          <w:sz w:val="16"/>
+          <w:szCs w:val="16"/>
+          <w:lang w:val="en-US"/>
+        </w:rPr>
+        <w:t>suppressNotices</w:t>
+      </w:r>
+      <w:proofErr w:type="spellEnd"/>
+      <w:proofErr w:type="gramEnd"/>
+      <w:r>
+        <w:rPr>
+          <w:rFonts w:ascii="Consolas" w:hAnsi="Consolas"/>
+          <w:sz w:val="16"/>
+          <w:szCs w:val="16"/>
+          <w:lang w:val="en-US"/>
+        </w:rPr>
+        <w:t>: ['</w:t>
+      </w:r>
+      <w:proofErr w:type="spellStart"/>
+      <w:r>
+        <w:rPr>
+          <w:rFonts w:ascii="Consolas" w:hAnsi="Consolas"/>
+          <w:sz w:val="16"/>
+          <w:szCs w:val="16"/>
+          <w:lang w:val="en-US"/>
+        </w:rPr>
+        <w:t>yahooSurvey</w:t>
+      </w:r>
+      <w:proofErr w:type="spellEnd"/>
+      <w:r>
+        <w:rPr>
+          <w:rFonts w:ascii="Consolas" w:hAnsi="Consolas"/>
+          <w:sz w:val="16"/>
+          <w:szCs w:val="16"/>
+          <w:lang w:val="en-US"/>
+        </w:rPr>
+        <w:t>', '</w:t>
+      </w:r>
+      <w:proofErr w:type="spellStart"/>
+      <w:r>
+        <w:rPr>
+          <w:rFonts w:ascii="Consolas" w:hAnsi="Consolas"/>
+          <w:sz w:val="16"/>
+          <w:szCs w:val="16"/>
+          <w:lang w:val="en-US"/>
+        </w:rPr>
+        <w:t>ripHistorical</w:t>
+      </w:r>
+      <w:proofErr w:type="spellEnd"/>
+      <w:r>
+        <w:rPr>
+          <w:rFonts w:ascii="Consolas" w:hAnsi="Consolas"/>
+          <w:sz w:val="16"/>
+          <w:szCs w:val="16"/>
+          <w:lang w:val="en-US"/>
+        </w:rPr>
+        <w:t>'</w:t>
+      </w:r>
+      <w:proofErr w:type="gramStart"/>
+      <w:r>
+        <w:rPr>
+          <w:rFonts w:ascii="Consolas" w:hAnsi="Consolas"/>
+          <w:sz w:val="16"/>
+          <w:szCs w:val="16"/>
+          <w:lang w:val="en-US"/>
+        </w:rPr>
+        <w:t>] }</w:t>
+      </w:r>
+      <w:proofErr w:type="gramEnd"/>
+      <w:r>
+        <w:rPr>
+          <w:rFonts w:ascii="Consolas" w:hAnsi="Consolas"/>
+          <w:sz w:val="16"/>
+          <w:szCs w:val="16"/>
+          <w:lang w:val="en-US"/>
+        </w:rPr>
+        <w:t>);</w:t>
       </w:r>
     </w:p>
     <w:p>
@@ -4852,7 +5481,27 @@
           <w:szCs w:val="16"/>
           <w:lang w:val="en-US"/>
         </w:rPr>
-        <w:t>const fs = require('fs');</w:t>
+        <w:t>const fs = require('</w:t>
+      </w:r>
+      <w:proofErr w:type="spellStart"/>
+      <w:r>
+        <w:rPr>
+          <w:rFonts w:ascii="Consolas" w:hAnsi="Consolas"/>
+          <w:sz w:val="16"/>
+          <w:szCs w:val="16"/>
+          <w:lang w:val="en-US"/>
+        </w:rPr>
+        <w:t>fs'</w:t>
+      </w:r>
+      <w:proofErr w:type="spellEnd"/>
+      <w:r>
+        <w:rPr>
+          <w:rFonts w:ascii="Consolas" w:hAnsi="Consolas"/>
+          <w:sz w:val="16"/>
+          <w:szCs w:val="16"/>
+          <w:lang w:val="en-US"/>
+        </w:rPr>
+        <w:t>);</w:t>
       </w:r>
     </w:p>
     <w:p>
@@ -4883,8 +5532,50 @@
           <w:szCs w:val="16"/>
           <w:lang w:val="en-US"/>
         </w:rPr>
-        <w:t>async function exportDailyMarketCap(ticker, years = 10) {</w:t>
-      </w:r>
+        <w:t xml:space="preserve">async function </w:t>
+      </w:r>
+      <w:proofErr w:type="spellStart"/>
+      <w:proofErr w:type="gramStart"/>
+      <w:r>
+        <w:rPr>
+          <w:rFonts w:ascii="Consolas" w:hAnsi="Consolas"/>
+          <w:sz w:val="16"/>
+          <w:szCs w:val="16"/>
+          <w:lang w:val="en-US"/>
+        </w:rPr>
+        <w:t>exportDailyMarketCap</w:t>
+      </w:r>
+      <w:proofErr w:type="spellEnd"/>
+      <w:r>
+        <w:rPr>
+          <w:rFonts w:ascii="Consolas" w:hAnsi="Consolas"/>
+          <w:sz w:val="16"/>
+          <w:szCs w:val="16"/>
+          <w:lang w:val="en-US"/>
+        </w:rPr>
+        <w:t>(</w:t>
+      </w:r>
+      <w:proofErr w:type="gramEnd"/>
+      <w:r>
+        <w:rPr>
+          <w:rFonts w:ascii="Consolas" w:hAnsi="Consolas"/>
+          <w:sz w:val="16"/>
+          <w:szCs w:val="16"/>
+          <w:lang w:val="en-US"/>
+        </w:rPr>
+        <w:t xml:space="preserve">ticker, years = </w:t>
+      </w:r>
+      <w:proofErr w:type="gramStart"/>
+      <w:r>
+        <w:rPr>
+          <w:rFonts w:ascii="Consolas" w:hAnsi="Consolas"/>
+          <w:sz w:val="16"/>
+          <w:szCs w:val="16"/>
+          <w:lang w:val="en-US"/>
+        </w:rPr>
+        <w:t>10) {</w:t>
+      </w:r>
+      <w:proofErr w:type="gramEnd"/>
     </w:p>
     <w:p>
       <w:pPr>
@@ -4904,13 +5595,25 @@
         </w:rPr>
         <w:t xml:space="preserve">  </w:t>
       </w:r>
-      <w:r>
-        <w:rPr>
-          <w:rFonts w:ascii="Consolas" w:hAnsi="Consolas"/>
-          <w:sz w:val="16"/>
-          <w:szCs w:val="16"/>
-        </w:rPr>
-        <w:t>try {</w:t>
+      <w:proofErr w:type="spellStart"/>
+      <w:proofErr w:type="gramStart"/>
+      <w:r>
+        <w:rPr>
+          <w:rFonts w:ascii="Consolas" w:hAnsi="Consolas"/>
+          <w:sz w:val="16"/>
+          <w:szCs w:val="16"/>
+        </w:rPr>
+        <w:t>try</w:t>
+      </w:r>
+      <w:proofErr w:type="spellEnd"/>
+      <w:proofErr w:type="gramEnd"/>
+      <w:r>
+        <w:rPr>
+          <w:rFonts w:ascii="Consolas" w:hAnsi="Consolas"/>
+          <w:sz w:val="16"/>
+          <w:szCs w:val="16"/>
+        </w:rPr>
+        <w:t xml:space="preserve"> {</w:t>
       </w:r>
     </w:p>
     <w:p>
@@ -4956,7 +5659,27 @@
           <w:szCs w:val="16"/>
           <w:lang w:val="en-US"/>
         </w:rPr>
-        <w:t>const quote = await yahooFinance.quote(ticker);</w:t>
+        <w:t xml:space="preserve">const quote = await </w:t>
+      </w:r>
+      <w:proofErr w:type="spellStart"/>
+      <w:r>
+        <w:rPr>
+          <w:rFonts w:ascii="Consolas" w:hAnsi="Consolas"/>
+          <w:sz w:val="16"/>
+          <w:szCs w:val="16"/>
+          <w:lang w:val="en-US"/>
+        </w:rPr>
+        <w:t>yahooFinance.quote</w:t>
+      </w:r>
+      <w:proofErr w:type="spellEnd"/>
+      <w:r>
+        <w:rPr>
+          <w:rFonts w:ascii="Consolas" w:hAnsi="Consolas"/>
+          <w:sz w:val="16"/>
+          <w:szCs w:val="16"/>
+          <w:lang w:val="en-US"/>
+        </w:rPr>
+        <w:t>(ticker);</w:t>
       </w:r>
     </w:p>
     <w:p>
@@ -4976,7 +5699,50 @@
           <w:szCs w:val="16"/>
           <w:lang w:val="en-US"/>
         </w:rPr>
-        <w:t xml:space="preserve">    const sharesOutstanding = quote.sharesOutstanding;</w:t>
+        <w:lastRenderedPageBreak/>
+        <w:t xml:space="preserve">    const </w:t>
+      </w:r>
+      <w:proofErr w:type="spellStart"/>
+      <w:r>
+        <w:rPr>
+          <w:rFonts w:ascii="Consolas" w:hAnsi="Consolas"/>
+          <w:sz w:val="16"/>
+          <w:szCs w:val="16"/>
+          <w:lang w:val="en-US"/>
+        </w:rPr>
+        <w:t>sharesOutstanding</w:t>
+      </w:r>
+      <w:proofErr w:type="spellEnd"/>
+      <w:r>
+        <w:rPr>
+          <w:rFonts w:ascii="Consolas" w:hAnsi="Consolas"/>
+          <w:sz w:val="16"/>
+          <w:szCs w:val="16"/>
+          <w:lang w:val="en-US"/>
+        </w:rPr>
+        <w:t xml:space="preserve"> = </w:t>
+      </w:r>
+      <w:proofErr w:type="spellStart"/>
+      <w:proofErr w:type="gramStart"/>
+      <w:r>
+        <w:rPr>
+          <w:rFonts w:ascii="Consolas" w:hAnsi="Consolas"/>
+          <w:sz w:val="16"/>
+          <w:szCs w:val="16"/>
+          <w:lang w:val="en-US"/>
+        </w:rPr>
+        <w:t>quote.sharesOutstanding</w:t>
+      </w:r>
+      <w:proofErr w:type="spellEnd"/>
+      <w:proofErr w:type="gramEnd"/>
+      <w:r>
+        <w:rPr>
+          <w:rFonts w:ascii="Consolas" w:hAnsi="Consolas"/>
+          <w:sz w:val="16"/>
+          <w:szCs w:val="16"/>
+          <w:lang w:val="en-US"/>
+        </w:rPr>
+        <w:t>;</w:t>
       </w:r>
     </w:p>
     <w:p>
@@ -5007,7 +5773,38 @@
           <w:szCs w:val="16"/>
           <w:lang w:val="en-US"/>
         </w:rPr>
-        <w:t xml:space="preserve">    if (!sharesOutstanding) {</w:t>
+        <w:t xml:space="preserve">    if </w:t>
+      </w:r>
+      <w:proofErr w:type="gramStart"/>
+      <w:r>
+        <w:rPr>
+          <w:rFonts w:ascii="Consolas" w:hAnsi="Consolas"/>
+          <w:sz w:val="16"/>
+          <w:szCs w:val="16"/>
+          <w:lang w:val="en-US"/>
+        </w:rPr>
+        <w:t>(!</w:t>
+      </w:r>
+      <w:proofErr w:type="spellStart"/>
+      <w:r>
+        <w:rPr>
+          <w:rFonts w:ascii="Consolas" w:hAnsi="Consolas"/>
+          <w:sz w:val="16"/>
+          <w:szCs w:val="16"/>
+          <w:lang w:val="en-US"/>
+        </w:rPr>
+        <w:t>sharesOutstanding</w:t>
+      </w:r>
+      <w:proofErr w:type="spellEnd"/>
+      <w:proofErr w:type="gramEnd"/>
+      <w:r>
+        <w:rPr>
+          <w:rFonts w:ascii="Consolas" w:hAnsi="Consolas"/>
+          <w:sz w:val="16"/>
+          <w:szCs w:val="16"/>
+          <w:lang w:val="en-US"/>
+        </w:rPr>
+        <w:t>) {</w:t>
       </w:r>
     </w:p>
     <w:p>
@@ -5028,14 +5825,64 @@
         </w:rPr>
         <w:t xml:space="preserve">      </w:t>
       </w:r>
-      <w:r>
-        <w:rPr>
-          <w:rFonts w:ascii="Consolas" w:hAnsi="Consolas"/>
-          <w:sz w:val="16"/>
-          <w:szCs w:val="16"/>
-        </w:rPr>
-        <w:t>throw new Error("Impossible de récupérer le nombre d'actions en circulation.");</w:t>
-      </w:r>
+      <w:proofErr w:type="spellStart"/>
+      <w:proofErr w:type="gramStart"/>
+      <w:r>
+        <w:rPr>
+          <w:rFonts w:ascii="Consolas" w:hAnsi="Consolas"/>
+          <w:sz w:val="16"/>
+          <w:szCs w:val="16"/>
+        </w:rPr>
+        <w:t>throw</w:t>
+      </w:r>
+      <w:proofErr w:type="spellEnd"/>
+      <w:proofErr w:type="gramEnd"/>
+      <w:r>
+        <w:rPr>
+          <w:rFonts w:ascii="Consolas" w:hAnsi="Consolas"/>
+          <w:sz w:val="16"/>
+          <w:szCs w:val="16"/>
+        </w:rPr>
+        <w:t xml:space="preserve"> new </w:t>
+      </w:r>
+      <w:proofErr w:type="spellStart"/>
+      <w:proofErr w:type="gramStart"/>
+      <w:r>
+        <w:rPr>
+          <w:rFonts w:ascii="Consolas" w:hAnsi="Consolas"/>
+          <w:sz w:val="16"/>
+          <w:szCs w:val="16"/>
+        </w:rPr>
+        <w:t>Error</w:t>
+      </w:r>
+      <w:proofErr w:type="spellEnd"/>
+      <w:r>
+        <w:rPr>
+          <w:rFonts w:ascii="Consolas" w:hAnsi="Consolas"/>
+          <w:sz w:val="16"/>
+          <w:szCs w:val="16"/>
+        </w:rPr>
+        <w:t>(</w:t>
+      </w:r>
+      <w:proofErr w:type="gramEnd"/>
+      <w:r>
+        <w:rPr>
+          <w:rFonts w:ascii="Consolas" w:hAnsi="Consolas"/>
+          <w:sz w:val="16"/>
+          <w:szCs w:val="16"/>
+        </w:rPr>
+        <w:t>"Impossible de récupérer le nombre d'actions en circulation."</w:t>
+      </w:r>
+      <w:proofErr w:type="gramStart"/>
+      <w:r>
+        <w:rPr>
+          <w:rFonts w:ascii="Consolas" w:hAnsi="Consolas"/>
+          <w:sz w:val="16"/>
+          <w:szCs w:val="16"/>
+        </w:rPr>
+        <w:t>);</w:t>
+      </w:r>
+      <w:proofErr w:type="gramEnd"/>
     </w:p>
     <w:p>
       <w:pPr>
@@ -5098,8 +5945,56 @@
           <w:sz w:val="16"/>
           <w:szCs w:val="16"/>
         </w:rPr>
-        <w:t xml:space="preserve">    const endDate = new Date();</w:t>
-      </w:r>
+        <w:t xml:space="preserve">    </w:t>
+      </w:r>
+      <w:proofErr w:type="spellStart"/>
+      <w:proofErr w:type="gramStart"/>
+      <w:r>
+        <w:rPr>
+          <w:rFonts w:ascii="Consolas" w:hAnsi="Consolas"/>
+          <w:sz w:val="16"/>
+          <w:szCs w:val="16"/>
+        </w:rPr>
+        <w:t>const</w:t>
+      </w:r>
+      <w:proofErr w:type="spellEnd"/>
+      <w:proofErr w:type="gramEnd"/>
+      <w:r>
+        <w:rPr>
+          <w:rFonts w:ascii="Consolas" w:hAnsi="Consolas"/>
+          <w:sz w:val="16"/>
+          <w:szCs w:val="16"/>
+        </w:rPr>
+        <w:t xml:space="preserve"> </w:t>
+      </w:r>
+      <w:proofErr w:type="spellStart"/>
+      <w:r>
+        <w:rPr>
+          <w:rFonts w:ascii="Consolas" w:hAnsi="Consolas"/>
+          <w:sz w:val="16"/>
+          <w:szCs w:val="16"/>
+        </w:rPr>
+        <w:t>endDate</w:t>
+      </w:r>
+      <w:proofErr w:type="spellEnd"/>
+      <w:r>
+        <w:rPr>
+          <w:rFonts w:ascii="Consolas" w:hAnsi="Consolas"/>
+          <w:sz w:val="16"/>
+          <w:szCs w:val="16"/>
+        </w:rPr>
+        <w:t xml:space="preserve"> = new </w:t>
+      </w:r>
+      <w:proofErr w:type="gramStart"/>
+      <w:r>
+        <w:rPr>
+          <w:rFonts w:ascii="Consolas" w:hAnsi="Consolas"/>
+          <w:sz w:val="16"/>
+          <w:szCs w:val="16"/>
+        </w:rPr>
+        <w:t>Date();</w:t>
+      </w:r>
+      <w:proofErr w:type="gramEnd"/>
     </w:p>
     <w:p>
       <w:pPr>
@@ -5126,7 +6021,47 @@
           <w:szCs w:val="16"/>
           <w:lang w:val="en-US"/>
         </w:rPr>
-        <w:t>const startDate = new Date();</w:t>
+        <w:t xml:space="preserve">const </w:t>
+      </w:r>
+      <w:proofErr w:type="spellStart"/>
+      <w:r>
+        <w:rPr>
+          <w:rFonts w:ascii="Consolas" w:hAnsi="Consolas"/>
+          <w:sz w:val="16"/>
+          <w:szCs w:val="16"/>
+          <w:lang w:val="en-US"/>
+        </w:rPr>
+        <w:t>startDate</w:t>
+      </w:r>
+      <w:proofErr w:type="spellEnd"/>
+      <w:r>
+        <w:rPr>
+          <w:rFonts w:ascii="Consolas" w:hAnsi="Consolas"/>
+          <w:sz w:val="16"/>
+          <w:szCs w:val="16"/>
+          <w:lang w:val="en-US"/>
+        </w:rPr>
+        <w:t xml:space="preserve"> = new </w:t>
+      </w:r>
+      <w:proofErr w:type="gramStart"/>
+      <w:r>
+        <w:rPr>
+          <w:rFonts w:ascii="Consolas" w:hAnsi="Consolas"/>
+          <w:sz w:val="16"/>
+          <w:szCs w:val="16"/>
+          <w:lang w:val="en-US"/>
+        </w:rPr>
+        <w:t>Date(</w:t>
+      </w:r>
+      <w:proofErr w:type="gramEnd"/>
+      <w:r>
+        <w:rPr>
+          <w:rFonts w:ascii="Consolas" w:hAnsi="Consolas"/>
+          <w:sz w:val="16"/>
+          <w:szCs w:val="16"/>
+          <w:lang w:val="en-US"/>
+        </w:rPr>
+        <w:t>);</w:t>
       </w:r>
     </w:p>
     <w:p>
@@ -5146,7 +6081,47 @@
           <w:szCs w:val="16"/>
           <w:lang w:val="en-US"/>
         </w:rPr>
-        <w:t xml:space="preserve">    startDate.setFullYear(endDate.getFullYear() - years);</w:t>
+        <w:t xml:space="preserve">    </w:t>
+      </w:r>
+      <w:proofErr w:type="spellStart"/>
+      <w:r>
+        <w:rPr>
+          <w:rFonts w:ascii="Consolas" w:hAnsi="Consolas"/>
+          <w:sz w:val="16"/>
+          <w:szCs w:val="16"/>
+          <w:lang w:val="en-US"/>
+        </w:rPr>
+        <w:t>startDate.setFullYear</w:t>
+      </w:r>
+      <w:proofErr w:type="spellEnd"/>
+      <w:r>
+        <w:rPr>
+          <w:rFonts w:ascii="Consolas" w:hAnsi="Consolas"/>
+          <w:sz w:val="16"/>
+          <w:szCs w:val="16"/>
+          <w:lang w:val="en-US"/>
+        </w:rPr>
+        <w:t>(</w:t>
+      </w:r>
+      <w:proofErr w:type="spellStart"/>
+      <w:r>
+        <w:rPr>
+          <w:rFonts w:ascii="Consolas" w:hAnsi="Consolas"/>
+          <w:sz w:val="16"/>
+          <w:szCs w:val="16"/>
+          <w:lang w:val="en-US"/>
+        </w:rPr>
+        <w:t>endDate.getFullYear</w:t>
+      </w:r>
+      <w:proofErr w:type="spellEnd"/>
+      <w:r>
+        <w:rPr>
+          <w:rFonts w:ascii="Consolas" w:hAnsi="Consolas"/>
+          <w:sz w:val="16"/>
+          <w:szCs w:val="16"/>
+          <w:lang w:val="en-US"/>
+        </w:rPr>
+        <w:t>() - years);</w:t>
       </w:r>
     </w:p>
     <w:p>
@@ -5212,7 +6187,27 @@
           <w:szCs w:val="16"/>
           <w:lang w:val="en-US"/>
         </w:rPr>
-        <w:t>const result = await yahooFinance.chart(ticker, {</w:t>
+        <w:t xml:space="preserve">const result = await </w:t>
+      </w:r>
+      <w:proofErr w:type="spellStart"/>
+      <w:r>
+        <w:rPr>
+          <w:rFonts w:ascii="Consolas" w:hAnsi="Consolas"/>
+          <w:sz w:val="16"/>
+          <w:szCs w:val="16"/>
+          <w:lang w:val="en-US"/>
+        </w:rPr>
+        <w:t>yahooFinance.chart</w:t>
+      </w:r>
+      <w:proofErr w:type="spellEnd"/>
+      <w:r>
+        <w:rPr>
+          <w:rFonts w:ascii="Consolas" w:hAnsi="Consolas"/>
+          <w:sz w:val="16"/>
+          <w:szCs w:val="16"/>
+          <w:lang w:val="en-US"/>
+        </w:rPr>
+        <w:t>(ticker, {</w:t>
       </w:r>
     </w:p>
     <w:p>
@@ -5232,7 +6227,27 @@
           <w:szCs w:val="16"/>
           <w:lang w:val="en-US"/>
         </w:rPr>
-        <w:t xml:space="preserve">      period1: startDate,</w:t>
+        <w:t xml:space="preserve">      period1: </w:t>
+      </w:r>
+      <w:proofErr w:type="spellStart"/>
+      <w:r>
+        <w:rPr>
+          <w:rFonts w:ascii="Consolas" w:hAnsi="Consolas"/>
+          <w:sz w:val="16"/>
+          <w:szCs w:val="16"/>
+          <w:lang w:val="en-US"/>
+        </w:rPr>
+        <w:t>startDate</w:t>
+      </w:r>
+      <w:proofErr w:type="spellEnd"/>
+      <w:r>
+        <w:rPr>
+          <w:rFonts w:ascii="Consolas" w:hAnsi="Consolas"/>
+          <w:sz w:val="16"/>
+          <w:szCs w:val="16"/>
+          <w:lang w:val="en-US"/>
+        </w:rPr>
+        <w:t>,</w:t>
       </w:r>
     </w:p>
     <w:p>
@@ -5252,7 +6267,27 @@
           <w:szCs w:val="16"/>
           <w:lang w:val="en-US"/>
         </w:rPr>
-        <w:t xml:space="preserve">      period2: endDate,</w:t>
+        <w:t xml:space="preserve">      period2: </w:t>
+      </w:r>
+      <w:proofErr w:type="spellStart"/>
+      <w:r>
+        <w:rPr>
+          <w:rFonts w:ascii="Consolas" w:hAnsi="Consolas"/>
+          <w:sz w:val="16"/>
+          <w:szCs w:val="16"/>
+          <w:lang w:val="en-US"/>
+        </w:rPr>
+        <w:t>endDate</w:t>
+      </w:r>
+      <w:proofErr w:type="spellEnd"/>
+      <w:r>
+        <w:rPr>
+          <w:rFonts w:ascii="Consolas" w:hAnsi="Consolas"/>
+          <w:sz w:val="16"/>
+          <w:szCs w:val="16"/>
+          <w:lang w:val="en-US"/>
+        </w:rPr>
+        <w:t>,</w:t>
       </w:r>
     </w:p>
     <w:p>
@@ -5327,8 +6362,76 @@
           <w:sz w:val="16"/>
           <w:szCs w:val="16"/>
         </w:rPr>
-        <w:t xml:space="preserve">    const quotes = result.quotes || [];</w:t>
-      </w:r>
+        <w:t xml:space="preserve">    </w:t>
+      </w:r>
+      <w:proofErr w:type="spellStart"/>
+      <w:proofErr w:type="gramStart"/>
+      <w:r>
+        <w:rPr>
+          <w:rFonts w:ascii="Consolas" w:hAnsi="Consolas"/>
+          <w:sz w:val="16"/>
+          <w:szCs w:val="16"/>
+        </w:rPr>
+        <w:t>const</w:t>
+      </w:r>
+      <w:proofErr w:type="spellEnd"/>
+      <w:proofErr w:type="gramEnd"/>
+      <w:r>
+        <w:rPr>
+          <w:rFonts w:ascii="Consolas" w:hAnsi="Consolas"/>
+          <w:sz w:val="16"/>
+          <w:szCs w:val="16"/>
+        </w:rPr>
+        <w:t xml:space="preserve"> </w:t>
+      </w:r>
+      <w:proofErr w:type="spellStart"/>
+      <w:r>
+        <w:rPr>
+          <w:rFonts w:ascii="Consolas" w:hAnsi="Consolas"/>
+          <w:sz w:val="16"/>
+          <w:szCs w:val="16"/>
+        </w:rPr>
+        <w:t>quotes</w:t>
+      </w:r>
+      <w:proofErr w:type="spellEnd"/>
+      <w:r>
+        <w:rPr>
+          <w:rFonts w:ascii="Consolas" w:hAnsi="Consolas"/>
+          <w:sz w:val="16"/>
+          <w:szCs w:val="16"/>
+        </w:rPr>
+        <w:t xml:space="preserve"> = </w:t>
+      </w:r>
+      <w:proofErr w:type="spellStart"/>
+      <w:proofErr w:type="gramStart"/>
+      <w:r>
+        <w:rPr>
+          <w:rFonts w:ascii="Consolas" w:hAnsi="Consolas"/>
+          <w:sz w:val="16"/>
+          <w:szCs w:val="16"/>
+        </w:rPr>
+        <w:t>result.quotes</w:t>
+      </w:r>
+      <w:proofErr w:type="spellEnd"/>
+      <w:proofErr w:type="gramEnd"/>
+      <w:r>
+        <w:rPr>
+          <w:rFonts w:ascii="Consolas" w:hAnsi="Consolas"/>
+          <w:sz w:val="16"/>
+          <w:szCs w:val="16"/>
+        </w:rPr>
+        <w:t xml:space="preserve"> || [</w:t>
+      </w:r>
+      <w:proofErr w:type="gramStart"/>
+      <w:r>
+        <w:rPr>
+          <w:rFonts w:ascii="Consolas" w:hAnsi="Consolas"/>
+          <w:sz w:val="16"/>
+          <w:szCs w:val="16"/>
+        </w:rPr>
+        <w:t>];</w:t>
+      </w:r>
+      <w:proofErr w:type="gramEnd"/>
     </w:p>
     <w:p>
       <w:pPr>
@@ -5383,7 +6486,58 @@
           <w:szCs w:val="16"/>
           <w:lang w:val="en-US"/>
         </w:rPr>
-        <w:t>const header = 'Date,Close,Shares_Outstanding,Market_Cap\n';</w:t>
+        <w:t>const header = '</w:t>
+      </w:r>
+      <w:proofErr w:type="spellStart"/>
+      <w:proofErr w:type="gramStart"/>
+      <w:r>
+        <w:rPr>
+          <w:rFonts w:ascii="Consolas" w:hAnsi="Consolas"/>
+          <w:sz w:val="16"/>
+          <w:szCs w:val="16"/>
+          <w:lang w:val="en-US"/>
+        </w:rPr>
+        <w:t>Date,Close</w:t>
+      </w:r>
+      <w:proofErr w:type="gramEnd"/>
+      <w:r>
+        <w:rPr>
+          <w:rFonts w:ascii="Consolas" w:hAnsi="Consolas"/>
+          <w:sz w:val="16"/>
+          <w:szCs w:val="16"/>
+          <w:lang w:val="en-US"/>
+        </w:rPr>
+        <w:t>,Shares_</w:t>
+      </w:r>
+      <w:proofErr w:type="gramStart"/>
+      <w:r>
+        <w:rPr>
+          <w:rFonts w:ascii="Consolas" w:hAnsi="Consolas"/>
+          <w:sz w:val="16"/>
+          <w:szCs w:val="16"/>
+          <w:lang w:val="en-US"/>
+        </w:rPr>
+        <w:t>Outstanding,Market</w:t>
+      </w:r>
+      <w:proofErr w:type="gramEnd"/>
+      <w:r>
+        <w:rPr>
+          <w:rFonts w:ascii="Consolas" w:hAnsi="Consolas"/>
+          <w:sz w:val="16"/>
+          <w:szCs w:val="16"/>
+          <w:lang w:val="en-US"/>
+        </w:rPr>
+        <w:t>_Cap</w:t>
+      </w:r>
+      <w:proofErr w:type="spellEnd"/>
+      <w:r>
+        <w:rPr>
+          <w:rFonts w:ascii="Consolas" w:hAnsi="Consolas"/>
+          <w:sz w:val="16"/>
+          <w:szCs w:val="16"/>
+          <w:lang w:val="en-US"/>
+        </w:rPr>
+        <w:t>\n';</w:t>
       </w:r>
     </w:p>
     <w:p>
@@ -5403,7 +6557,6 @@
           <w:szCs w:val="16"/>
           <w:lang w:val="en-US"/>
         </w:rPr>
-        <w:lastRenderedPageBreak/>
         <w:t xml:space="preserve">    const rows = quotes</w:t>
       </w:r>
     </w:p>
@@ -5424,7 +6577,58 @@
           <w:szCs w:val="16"/>
           <w:lang w:val="en-US"/>
         </w:rPr>
-        <w:t xml:space="preserve">      .filter(row =&gt; row.close != null)</w:t>
+        <w:t xml:space="preserve">      </w:t>
+      </w:r>
+      <w:proofErr w:type="gramStart"/>
+      <w:r>
+        <w:rPr>
+          <w:rFonts w:ascii="Consolas" w:hAnsi="Consolas"/>
+          <w:sz w:val="16"/>
+          <w:szCs w:val="16"/>
+          <w:lang w:val="en-US"/>
+        </w:rPr>
+        <w:t>.filter</w:t>
+      </w:r>
+      <w:proofErr w:type="gramEnd"/>
+      <w:r>
+        <w:rPr>
+          <w:rFonts w:ascii="Consolas" w:hAnsi="Consolas"/>
+          <w:sz w:val="16"/>
+          <w:szCs w:val="16"/>
+          <w:lang w:val="en-US"/>
+        </w:rPr>
+        <w:t xml:space="preserve">(row =&gt; </w:t>
+      </w:r>
+      <w:proofErr w:type="spellStart"/>
+      <w:proofErr w:type="gramStart"/>
+      <w:r>
+        <w:rPr>
+          <w:rFonts w:ascii="Consolas" w:hAnsi="Consolas"/>
+          <w:sz w:val="16"/>
+          <w:szCs w:val="16"/>
+          <w:lang w:val="en-US"/>
+        </w:rPr>
+        <w:t>row.close</w:t>
+      </w:r>
+      <w:proofErr w:type="spellEnd"/>
+      <w:r>
+        <w:rPr>
+          <w:rFonts w:ascii="Consolas" w:hAnsi="Consolas"/>
+          <w:sz w:val="16"/>
+          <w:szCs w:val="16"/>
+          <w:lang w:val="en-US"/>
+        </w:rPr>
+        <w:t xml:space="preserve"> !=</w:t>
+      </w:r>
+      <w:proofErr w:type="gramEnd"/>
+      <w:r>
+        <w:rPr>
+          <w:rFonts w:ascii="Consolas" w:hAnsi="Consolas"/>
+          <w:sz w:val="16"/>
+          <w:szCs w:val="16"/>
+          <w:lang w:val="en-US"/>
+        </w:rPr>
+        <w:t xml:space="preserve"> null)</w:t>
       </w:r>
     </w:p>
     <w:p>
@@ -5444,7 +6648,27 @@
           <w:szCs w:val="16"/>
           <w:lang w:val="en-US"/>
         </w:rPr>
-        <w:t xml:space="preserve">      .map(row =&gt; {</w:t>
+        <w:t xml:space="preserve">      </w:t>
+      </w:r>
+      <w:proofErr w:type="gramStart"/>
+      <w:r>
+        <w:rPr>
+          <w:rFonts w:ascii="Consolas" w:hAnsi="Consolas"/>
+          <w:sz w:val="16"/>
+          <w:szCs w:val="16"/>
+          <w:lang w:val="en-US"/>
+        </w:rPr>
+        <w:t>.map</w:t>
+      </w:r>
+      <w:proofErr w:type="gramEnd"/>
+      <w:r>
+        <w:rPr>
+          <w:rFonts w:ascii="Consolas" w:hAnsi="Consolas"/>
+          <w:sz w:val="16"/>
+          <w:szCs w:val="16"/>
+          <w:lang w:val="en-US"/>
+        </w:rPr>
+        <w:t>(row =&gt; {</w:t>
       </w:r>
     </w:p>
     <w:p>
@@ -5464,7 +6688,89 @@
           <w:szCs w:val="16"/>
           <w:lang w:val="en-US"/>
         </w:rPr>
-        <w:t xml:space="preserve">        const date = new Date(row.date).toISOString().split('T')[0];</w:t>
+        <w:t xml:space="preserve">        const date = new Date(</w:t>
+      </w:r>
+      <w:proofErr w:type="spellStart"/>
+      <w:proofErr w:type="gramStart"/>
+      <w:r>
+        <w:rPr>
+          <w:rFonts w:ascii="Consolas" w:hAnsi="Consolas"/>
+          <w:sz w:val="16"/>
+          <w:szCs w:val="16"/>
+          <w:lang w:val="en-US"/>
+        </w:rPr>
+        <w:t>row.date</w:t>
+      </w:r>
+      <w:proofErr w:type="spellEnd"/>
+      <w:r>
+        <w:rPr>
+          <w:rFonts w:ascii="Consolas" w:hAnsi="Consolas"/>
+          <w:sz w:val="16"/>
+          <w:szCs w:val="16"/>
+          <w:lang w:val="en-US"/>
+        </w:rPr>
+        <w:t>).</w:t>
+      </w:r>
+      <w:proofErr w:type="spellStart"/>
+      <w:r>
+        <w:rPr>
+          <w:rFonts w:ascii="Consolas" w:hAnsi="Consolas"/>
+          <w:sz w:val="16"/>
+          <w:szCs w:val="16"/>
+          <w:lang w:val="en-US"/>
+        </w:rPr>
+        <w:t>toISOString</w:t>
+      </w:r>
+      <w:proofErr w:type="spellEnd"/>
+      <w:proofErr w:type="gramEnd"/>
+      <w:r>
+        <w:rPr>
+          <w:rFonts w:ascii="Consolas" w:hAnsi="Consolas"/>
+          <w:sz w:val="16"/>
+          <w:szCs w:val="16"/>
+          <w:lang w:val="en-US"/>
+        </w:rPr>
+        <w:t>(</w:t>
+      </w:r>
+      <w:proofErr w:type="gramStart"/>
+      <w:r>
+        <w:rPr>
+          <w:rFonts w:ascii="Consolas" w:hAnsi="Consolas"/>
+          <w:sz w:val="16"/>
+          <w:szCs w:val="16"/>
+          <w:lang w:val="en-US"/>
+        </w:rPr>
+        <w:t>).split</w:t>
+      </w:r>
+      <w:proofErr w:type="gramEnd"/>
+      <w:r>
+        <w:rPr>
+          <w:rFonts w:ascii="Consolas" w:hAnsi="Consolas"/>
+          <w:sz w:val="16"/>
+          <w:szCs w:val="16"/>
+          <w:lang w:val="en-US"/>
+        </w:rPr>
+        <w:t>('T</w:t>
+      </w:r>
+      <w:proofErr w:type="gramStart"/>
+      <w:r>
+        <w:rPr>
+          <w:rFonts w:ascii="Consolas" w:hAnsi="Consolas"/>
+          <w:sz w:val="16"/>
+          <w:szCs w:val="16"/>
+          <w:lang w:val="en-US"/>
+        </w:rPr>
+        <w:t>')[</w:t>
+      </w:r>
+      <w:proofErr w:type="gramEnd"/>
+      <w:r>
+        <w:rPr>
+          <w:rFonts w:ascii="Consolas" w:hAnsi="Consolas"/>
+          <w:sz w:val="16"/>
+          <w:szCs w:val="16"/>
+          <w:lang w:val="en-US"/>
+        </w:rPr>
+        <w:t>0];</w:t>
       </w:r>
     </w:p>
     <w:p>
@@ -5484,7 +6790,58 @@
           <w:szCs w:val="16"/>
           <w:lang w:val="en-US"/>
         </w:rPr>
-        <w:t xml:space="preserve">        const close = row.close.toFixed(2);</w:t>
+        <w:t xml:space="preserve">        const close = </w:t>
+      </w:r>
+      <w:proofErr w:type="spellStart"/>
+      <w:proofErr w:type="gramStart"/>
+      <w:r>
+        <w:rPr>
+          <w:rFonts w:ascii="Consolas" w:hAnsi="Consolas"/>
+          <w:sz w:val="16"/>
+          <w:szCs w:val="16"/>
+          <w:lang w:val="en-US"/>
+        </w:rPr>
+        <w:t>row.close</w:t>
+      </w:r>
+      <w:proofErr w:type="gramEnd"/>
+      <w:r>
+        <w:rPr>
+          <w:rFonts w:ascii="Consolas" w:hAnsi="Consolas"/>
+          <w:sz w:val="16"/>
+          <w:szCs w:val="16"/>
+          <w:lang w:val="en-US"/>
+        </w:rPr>
+        <w:t>.</w:t>
+      </w:r>
+      <w:proofErr w:type="gramStart"/>
+      <w:r>
+        <w:rPr>
+          <w:rFonts w:ascii="Consolas" w:hAnsi="Consolas"/>
+          <w:sz w:val="16"/>
+          <w:szCs w:val="16"/>
+          <w:lang w:val="en-US"/>
+        </w:rPr>
+        <w:t>toFixed</w:t>
+      </w:r>
+      <w:proofErr w:type="spellEnd"/>
+      <w:r>
+        <w:rPr>
+          <w:rFonts w:ascii="Consolas" w:hAnsi="Consolas"/>
+          <w:sz w:val="16"/>
+          <w:szCs w:val="16"/>
+          <w:lang w:val="en-US"/>
+        </w:rPr>
+        <w:t>(</w:t>
+      </w:r>
+      <w:proofErr w:type="gramEnd"/>
+      <w:r>
+        <w:rPr>
+          <w:rFonts w:ascii="Consolas" w:hAnsi="Consolas"/>
+          <w:sz w:val="16"/>
+          <w:szCs w:val="16"/>
+          <w:lang w:val="en-US"/>
+        </w:rPr>
+        <w:t>2);</w:t>
       </w:r>
     </w:p>
     <w:p>
@@ -5504,7 +6861,91 @@
           <w:szCs w:val="16"/>
           <w:lang w:val="en-US"/>
         </w:rPr>
-        <w:t xml:space="preserve">        const marketCap = (row.close * sharesOutstanding).toFixed(0);</w:t>
+        <w:t xml:space="preserve">        const </w:t>
+      </w:r>
+      <w:proofErr w:type="spellStart"/>
+      <w:r>
+        <w:rPr>
+          <w:rFonts w:ascii="Consolas" w:hAnsi="Consolas"/>
+          <w:sz w:val="16"/>
+          <w:szCs w:val="16"/>
+          <w:lang w:val="en-US"/>
+        </w:rPr>
+        <w:t>marketCap</w:t>
+      </w:r>
+      <w:proofErr w:type="spellEnd"/>
+      <w:r>
+        <w:rPr>
+          <w:rFonts w:ascii="Consolas" w:hAnsi="Consolas"/>
+          <w:sz w:val="16"/>
+          <w:szCs w:val="16"/>
+          <w:lang w:val="en-US"/>
+        </w:rPr>
+        <w:t xml:space="preserve"> = (</w:t>
+      </w:r>
+      <w:proofErr w:type="spellStart"/>
+      <w:proofErr w:type="gramStart"/>
+      <w:r>
+        <w:rPr>
+          <w:rFonts w:ascii="Consolas" w:hAnsi="Consolas"/>
+          <w:sz w:val="16"/>
+          <w:szCs w:val="16"/>
+          <w:lang w:val="en-US"/>
+        </w:rPr>
+        <w:t>row.close</w:t>
+      </w:r>
+      <w:proofErr w:type="spellEnd"/>
+      <w:proofErr w:type="gramEnd"/>
+      <w:r>
+        <w:rPr>
+          <w:rFonts w:ascii="Consolas" w:hAnsi="Consolas"/>
+          <w:sz w:val="16"/>
+          <w:szCs w:val="16"/>
+          <w:lang w:val="en-US"/>
+        </w:rPr>
+        <w:t xml:space="preserve"> * </w:t>
+      </w:r>
+      <w:proofErr w:type="spellStart"/>
+      <w:r>
+        <w:rPr>
+          <w:rFonts w:ascii="Consolas" w:hAnsi="Consolas"/>
+          <w:sz w:val="16"/>
+          <w:szCs w:val="16"/>
+          <w:lang w:val="en-US"/>
+        </w:rPr>
+        <w:t>sharesOutstanding</w:t>
+      </w:r>
+      <w:proofErr w:type="spellEnd"/>
+      <w:proofErr w:type="gramStart"/>
+      <w:r>
+        <w:rPr>
+          <w:rFonts w:ascii="Consolas" w:hAnsi="Consolas"/>
+          <w:sz w:val="16"/>
+          <w:szCs w:val="16"/>
+          <w:lang w:val="en-US"/>
+        </w:rPr>
+        <w:t>).</w:t>
+      </w:r>
+      <w:proofErr w:type="spellStart"/>
+      <w:r>
+        <w:rPr>
+          <w:rFonts w:ascii="Consolas" w:hAnsi="Consolas"/>
+          <w:sz w:val="16"/>
+          <w:szCs w:val="16"/>
+          <w:lang w:val="en-US"/>
+        </w:rPr>
+        <w:t>toFixed</w:t>
+      </w:r>
+      <w:proofErr w:type="spellEnd"/>
+      <w:proofErr w:type="gramEnd"/>
+      <w:r>
+        <w:rPr>
+          <w:rFonts w:ascii="Consolas" w:hAnsi="Consolas"/>
+          <w:sz w:val="16"/>
+          <w:szCs w:val="16"/>
+          <w:lang w:val="en-US"/>
+        </w:rPr>
+        <w:t>(0);</w:t>
       </w:r>
     </w:p>
     <w:p>
@@ -5524,7 +6965,98 @@
           <w:szCs w:val="16"/>
           <w:lang w:val="en-US"/>
         </w:rPr>
-        <w:t xml:space="preserve">        return `${date},${close},${sharesOutstanding},${marketCap}`;</w:t>
+        <w:t xml:space="preserve">        return `${date</w:t>
+      </w:r>
+      <w:proofErr w:type="gramStart"/>
+      <w:r>
+        <w:rPr>
+          <w:rFonts w:ascii="Consolas" w:hAnsi="Consolas"/>
+          <w:sz w:val="16"/>
+          <w:szCs w:val="16"/>
+          <w:lang w:val="en-US"/>
+        </w:rPr>
+        <w:t>},$</w:t>
+      </w:r>
+      <w:proofErr w:type="gramEnd"/>
+      <w:r>
+        <w:rPr>
+          <w:rFonts w:ascii="Consolas" w:hAnsi="Consolas"/>
+          <w:sz w:val="16"/>
+          <w:szCs w:val="16"/>
+          <w:lang w:val="en-US"/>
+        </w:rPr>
+        <w:t>{close</w:t>
+      </w:r>
+      <w:proofErr w:type="gramStart"/>
+      <w:r>
+        <w:rPr>
+          <w:rFonts w:ascii="Consolas" w:hAnsi="Consolas"/>
+          <w:sz w:val="16"/>
+          <w:szCs w:val="16"/>
+          <w:lang w:val="en-US"/>
+        </w:rPr>
+        <w:t>},$</w:t>
+      </w:r>
+      <w:proofErr w:type="gramEnd"/>
+      <w:r>
+        <w:rPr>
+          <w:rFonts w:ascii="Consolas" w:hAnsi="Consolas"/>
+          <w:sz w:val="16"/>
+          <w:szCs w:val="16"/>
+          <w:lang w:val="en-US"/>
+        </w:rPr>
+        <w:t>{</w:t>
+      </w:r>
+      <w:proofErr w:type="spellStart"/>
+      <w:r>
+        <w:rPr>
+          <w:rFonts w:ascii="Consolas" w:hAnsi="Consolas"/>
+          <w:sz w:val="16"/>
+          <w:szCs w:val="16"/>
+          <w:lang w:val="en-US"/>
+        </w:rPr>
+        <w:t>sharesOutstanding</w:t>
+      </w:r>
+      <w:proofErr w:type="spellEnd"/>
+      <w:proofErr w:type="gramStart"/>
+      <w:r>
+        <w:rPr>
+          <w:rFonts w:ascii="Consolas" w:hAnsi="Consolas"/>
+          <w:sz w:val="16"/>
+          <w:szCs w:val="16"/>
+          <w:lang w:val="en-US"/>
+        </w:rPr>
+        <w:t>},$</w:t>
+      </w:r>
+      <w:proofErr w:type="gramEnd"/>
+      <w:r>
+        <w:rPr>
+          <w:rFonts w:ascii="Consolas" w:hAnsi="Consolas"/>
+          <w:sz w:val="16"/>
+          <w:szCs w:val="16"/>
+          <w:lang w:val="en-US"/>
+        </w:rPr>
+        <w:t>{</w:t>
+      </w:r>
+      <w:proofErr w:type="spellStart"/>
+      <w:r>
+        <w:rPr>
+          <w:rFonts w:ascii="Consolas" w:hAnsi="Consolas"/>
+          <w:sz w:val="16"/>
+          <w:szCs w:val="16"/>
+          <w:lang w:val="en-US"/>
+        </w:rPr>
+        <w:t>marketCap</w:t>
+      </w:r>
+      <w:proofErr w:type="spellEnd"/>
+      <w:r>
+        <w:rPr>
+          <w:rFonts w:ascii="Consolas" w:hAnsi="Consolas"/>
+          <w:sz w:val="16"/>
+          <w:szCs w:val="16"/>
+          <w:lang w:val="en-US"/>
+        </w:rPr>
+        <w:t>}`;</w:t>
       </w:r>
     </w:p>
     <w:p>
@@ -5569,8 +7101,46 @@
           <w:sz w:val="16"/>
           <w:szCs w:val="16"/>
         </w:rPr>
-        <w:t xml:space="preserve">      .join('\n');</w:t>
-      </w:r>
+        <w:t xml:space="preserve">      </w:t>
+      </w:r>
+      <w:proofErr w:type="gramStart"/>
+      <w:r>
+        <w:rPr>
+          <w:rFonts w:ascii="Consolas" w:hAnsi="Consolas"/>
+          <w:sz w:val="16"/>
+          <w:szCs w:val="16"/>
+        </w:rPr>
+        <w:t>.</w:t>
+      </w:r>
+      <w:proofErr w:type="spellStart"/>
+      <w:r>
+        <w:rPr>
+          <w:rFonts w:ascii="Consolas" w:hAnsi="Consolas"/>
+          <w:sz w:val="16"/>
+          <w:szCs w:val="16"/>
+        </w:rPr>
+        <w:t>join</w:t>
+      </w:r>
+      <w:proofErr w:type="spellEnd"/>
+      <w:proofErr w:type="gramEnd"/>
+      <w:r>
+        <w:rPr>
+          <w:rFonts w:ascii="Consolas" w:hAnsi="Consolas"/>
+          <w:sz w:val="16"/>
+          <w:szCs w:val="16"/>
+        </w:rPr>
+        <w:t>('\n'</w:t>
+      </w:r>
+      <w:proofErr w:type="gramStart"/>
+      <w:r>
+        <w:rPr>
+          <w:rFonts w:ascii="Consolas" w:hAnsi="Consolas"/>
+          <w:sz w:val="16"/>
+          <w:szCs w:val="16"/>
+        </w:rPr>
+        <w:t>);</w:t>
+      </w:r>
+      <w:proofErr w:type="gramEnd"/>
     </w:p>
     <w:p>
       <w:pPr>
@@ -5625,7 +7195,47 @@
           <w:szCs w:val="16"/>
           <w:lang w:val="en-US"/>
         </w:rPr>
-        <w:t>const fileName = `${ticker}_daily_market_cap_${years}y.csv`;</w:t>
+        <w:t xml:space="preserve">const </w:t>
+      </w:r>
+      <w:proofErr w:type="spellStart"/>
+      <w:r>
+        <w:rPr>
+          <w:rFonts w:ascii="Consolas" w:hAnsi="Consolas"/>
+          <w:sz w:val="16"/>
+          <w:szCs w:val="16"/>
+          <w:lang w:val="en-US"/>
+        </w:rPr>
+        <w:t>fileName</w:t>
+      </w:r>
+      <w:proofErr w:type="spellEnd"/>
+      <w:r>
+        <w:rPr>
+          <w:rFonts w:ascii="Consolas" w:hAnsi="Consolas"/>
+          <w:sz w:val="16"/>
+          <w:szCs w:val="16"/>
+          <w:lang w:val="en-US"/>
+        </w:rPr>
+        <w:t xml:space="preserve"> = `${ticker}_</w:t>
+      </w:r>
+      <w:proofErr w:type="spellStart"/>
+      <w:r>
+        <w:rPr>
+          <w:rFonts w:ascii="Consolas" w:hAnsi="Consolas"/>
+          <w:sz w:val="16"/>
+          <w:szCs w:val="16"/>
+          <w:lang w:val="en-US"/>
+        </w:rPr>
+        <w:t>daily_market_cap</w:t>
+      </w:r>
+      <w:proofErr w:type="spellEnd"/>
+      <w:r>
+        <w:rPr>
+          <w:rFonts w:ascii="Consolas" w:hAnsi="Consolas"/>
+          <w:sz w:val="16"/>
+          <w:szCs w:val="16"/>
+          <w:lang w:val="en-US"/>
+        </w:rPr>
+        <w:t>_${years}y.csv`;</w:t>
       </w:r>
     </w:p>
     <w:p>
@@ -5645,7 +7255,49 @@
           <w:szCs w:val="16"/>
           <w:lang w:val="en-US"/>
         </w:rPr>
-        <w:t xml:space="preserve">    fs.writeFileSync(fileName, header + rows, 'utf-8');</w:t>
+        <w:t xml:space="preserve">    </w:t>
+      </w:r>
+      <w:proofErr w:type="spellStart"/>
+      <w:proofErr w:type="gramStart"/>
+      <w:r>
+        <w:rPr>
+          <w:rFonts w:ascii="Consolas" w:hAnsi="Consolas"/>
+          <w:sz w:val="16"/>
+          <w:szCs w:val="16"/>
+          <w:lang w:val="en-US"/>
+        </w:rPr>
+        <w:t>fs.writeFileSync</w:t>
+      </w:r>
+      <w:proofErr w:type="spellEnd"/>
+      <w:proofErr w:type="gramEnd"/>
+      <w:r>
+        <w:rPr>
+          <w:rFonts w:ascii="Consolas" w:hAnsi="Consolas"/>
+          <w:sz w:val="16"/>
+          <w:szCs w:val="16"/>
+          <w:lang w:val="en-US"/>
+        </w:rPr>
+        <w:t>(</w:t>
+      </w:r>
+      <w:proofErr w:type="spellStart"/>
+      <w:r>
+        <w:rPr>
+          <w:rFonts w:ascii="Consolas" w:hAnsi="Consolas"/>
+          <w:sz w:val="16"/>
+          <w:szCs w:val="16"/>
+          <w:lang w:val="en-US"/>
+        </w:rPr>
+        <w:t>fileName</w:t>
+      </w:r>
+      <w:proofErr w:type="spellEnd"/>
+      <w:r>
+        <w:rPr>
+          <w:rFonts w:ascii="Consolas" w:hAnsi="Consolas"/>
+          <w:sz w:val="16"/>
+          <w:szCs w:val="16"/>
+          <w:lang w:val="en-US"/>
+        </w:rPr>
+        <w:t>, header + rows, 'utf-8');</w:t>
       </w:r>
     </w:p>
     <w:p>
@@ -5666,14 +7318,72 @@
         </w:rPr>
         <w:t xml:space="preserve">    </w:t>
       </w:r>
-      <w:r>
-        <w:rPr>
-          <w:rFonts w:ascii="Consolas" w:hAnsi="Consolas"/>
-          <w:sz w:val="16"/>
-          <w:szCs w:val="16"/>
-        </w:rPr>
-        <w:t>console.log(`Succès : ${quotes.length} jours enregistrés dans ${fileName}`);</w:t>
-      </w:r>
+      <w:proofErr w:type="gramStart"/>
+      <w:r>
+        <w:rPr>
+          <w:rFonts w:ascii="Consolas" w:hAnsi="Consolas"/>
+          <w:sz w:val="16"/>
+          <w:szCs w:val="16"/>
+        </w:rPr>
+        <w:t>console.log(</w:t>
+      </w:r>
+      <w:proofErr w:type="gramEnd"/>
+      <w:r>
+        <w:rPr>
+          <w:rFonts w:ascii="Consolas" w:hAnsi="Consolas"/>
+          <w:sz w:val="16"/>
+          <w:szCs w:val="16"/>
+        </w:rPr>
+        <w:t>`Succès : ${</w:t>
+      </w:r>
+      <w:proofErr w:type="spellStart"/>
+      <w:proofErr w:type="gramStart"/>
+      <w:r>
+        <w:rPr>
+          <w:rFonts w:ascii="Consolas" w:hAnsi="Consolas"/>
+          <w:sz w:val="16"/>
+          <w:szCs w:val="16"/>
+        </w:rPr>
+        <w:t>quotes.length</w:t>
+      </w:r>
+      <w:proofErr w:type="spellEnd"/>
+      <w:proofErr w:type="gramEnd"/>
+      <w:r>
+        <w:rPr>
+          <w:rFonts w:ascii="Consolas" w:hAnsi="Consolas"/>
+          <w:sz w:val="16"/>
+          <w:szCs w:val="16"/>
+        </w:rPr>
+        <w:t>} jours enregistrés dans ${</w:t>
+      </w:r>
+      <w:proofErr w:type="spellStart"/>
+      <w:r>
+        <w:rPr>
+          <w:rFonts w:ascii="Consolas" w:hAnsi="Consolas"/>
+          <w:sz w:val="16"/>
+          <w:szCs w:val="16"/>
+        </w:rPr>
+        <w:t>fileName</w:t>
+      </w:r>
+      <w:proofErr w:type="spellEnd"/>
+      <w:r>
+        <w:rPr>
+          <w:rFonts w:ascii="Consolas" w:hAnsi="Consolas"/>
+          <w:sz w:val="16"/>
+          <w:szCs w:val="16"/>
+        </w:rPr>
+        <w:t>}`</w:t>
+      </w:r>
+      <w:proofErr w:type="gramStart"/>
+      <w:r>
+        <w:rPr>
+          <w:rFonts w:ascii="Consolas" w:hAnsi="Consolas"/>
+          <w:sz w:val="16"/>
+          <w:szCs w:val="16"/>
+        </w:rPr>
+        <w:t>);</w:t>
+      </w:r>
+      <w:proofErr w:type="gramEnd"/>
     </w:p>
     <w:p>
       <w:pPr>
@@ -5690,7 +7400,25 @@
           <w:sz w:val="16"/>
           <w:szCs w:val="16"/>
         </w:rPr>
-        <w:t xml:space="preserve">  } catch (error) {</w:t>
+        <w:t xml:space="preserve">  } catch (</w:t>
+      </w:r>
+      <w:proofErr w:type="spellStart"/>
+      <w:r>
+        <w:rPr>
+          <w:rFonts w:ascii="Consolas" w:hAnsi="Consolas"/>
+          <w:sz w:val="16"/>
+          <w:szCs w:val="16"/>
+        </w:rPr>
+        <w:t>error</w:t>
+      </w:r>
+      <w:proofErr w:type="spellEnd"/>
+      <w:r>
+        <w:rPr>
+          <w:rFonts w:ascii="Consolas" w:hAnsi="Consolas"/>
+          <w:sz w:val="16"/>
+          <w:szCs w:val="16"/>
+        </w:rPr>
+        <w:t>) {</w:t>
       </w:r>
     </w:p>
     <w:p>
@@ -5708,8 +7436,48 @@
           <w:sz w:val="16"/>
           <w:szCs w:val="16"/>
         </w:rPr>
-        <w:t xml:space="preserve">    console.error('Erreur :', error.message);</w:t>
-      </w:r>
+        <w:t xml:space="preserve">    </w:t>
+      </w:r>
+      <w:proofErr w:type="spellStart"/>
+      <w:proofErr w:type="gramStart"/>
+      <w:r>
+        <w:rPr>
+          <w:rFonts w:ascii="Consolas" w:hAnsi="Consolas"/>
+          <w:sz w:val="16"/>
+          <w:szCs w:val="16"/>
+        </w:rPr>
+        <w:t>console.error</w:t>
+      </w:r>
+      <w:proofErr w:type="spellEnd"/>
+      <w:proofErr w:type="gramEnd"/>
+      <w:r>
+        <w:rPr>
+          <w:rFonts w:ascii="Consolas" w:hAnsi="Consolas"/>
+          <w:sz w:val="16"/>
+          <w:szCs w:val="16"/>
+        </w:rPr>
+        <w:t xml:space="preserve">('Erreur :', </w:t>
+      </w:r>
+      <w:proofErr w:type="spellStart"/>
+      <w:proofErr w:type="gramStart"/>
+      <w:r>
+        <w:rPr>
+          <w:rFonts w:ascii="Consolas" w:hAnsi="Consolas"/>
+          <w:sz w:val="16"/>
+          <w:szCs w:val="16"/>
+        </w:rPr>
+        <w:t>error.message</w:t>
+      </w:r>
+      <w:proofErr w:type="spellEnd"/>
+      <w:r>
+        <w:rPr>
+          <w:rFonts w:ascii="Consolas" w:hAnsi="Consolas"/>
+          <w:sz w:val="16"/>
+          <w:szCs w:val="16"/>
+        </w:rPr>
+        <w:t>);</w:t>
+      </w:r>
+      <w:proofErr w:type="gramEnd"/>
     </w:p>
     <w:p>
       <w:pPr>
@@ -5784,14 +7552,44 @@
           <w:szCs w:val="16"/>
         </w:rPr>
       </w:pPr>
-      <w:r>
-        <w:rPr>
-          <w:rFonts w:ascii="Consolas" w:hAnsi="Consolas"/>
-          <w:sz w:val="16"/>
-          <w:szCs w:val="16"/>
-        </w:rPr>
-        <w:t>exportDailyMarketCap('AAPL', 10);</w:t>
-      </w:r>
+      <w:proofErr w:type="spellStart"/>
+      <w:proofErr w:type="gramStart"/>
+      <w:r>
+        <w:rPr>
+          <w:rFonts w:ascii="Consolas" w:hAnsi="Consolas"/>
+          <w:sz w:val="16"/>
+          <w:szCs w:val="16"/>
+        </w:rPr>
+        <w:t>exportDailyMarketCap</w:t>
+      </w:r>
+      <w:proofErr w:type="spellEnd"/>
+      <w:r>
+        <w:rPr>
+          <w:rFonts w:ascii="Consolas" w:hAnsi="Consolas"/>
+          <w:sz w:val="16"/>
+          <w:szCs w:val="16"/>
+        </w:rPr>
+        <w:t>(</w:t>
+      </w:r>
+      <w:proofErr w:type="gramEnd"/>
+      <w:r>
+        <w:rPr>
+          <w:rFonts w:ascii="Consolas" w:hAnsi="Consolas"/>
+          <w:sz w:val="16"/>
+          <w:szCs w:val="16"/>
+        </w:rPr>
+        <w:t>'AAPL', 10</w:t>
+      </w:r>
+      <w:proofErr w:type="gramStart"/>
+      <w:r>
+        <w:rPr>
+          <w:rFonts w:ascii="Consolas" w:hAnsi="Consolas"/>
+          <w:sz w:val="16"/>
+          <w:szCs w:val="16"/>
+        </w:rPr>
+        <w:t>);</w:t>
+      </w:r>
+      <w:proofErr w:type="gramEnd"/>
     </w:p>
     <w:p>
       <w:pPr>
@@ -5809,51 +7607,77 @@
         <w:pStyle w:val="Corpsdetexte"/>
       </w:pPr>
       <w:r>
-        <w:t xml:space="preserve">De l’IA a été également utilisée dans plusieurs endroits dans le code à fin de m’aider à comprendre certains concepts ou me conseiller une solution adaptée tout en </w:t>
-      </w:r>
-      <w:r>
-        <w:t>la</w:t>
-      </w:r>
-      <w:r>
-        <w:t xml:space="preserve"> expliquant.</w:t>
+        <w:lastRenderedPageBreak/>
+        <w:t xml:space="preserve">De l’IA a été également utilisée dans plusieurs endroits dans le code </w:t>
+      </w:r>
+      <w:r>
+        <w:t>afin</w:t>
+      </w:r>
+      <w:r>
+        <w:t xml:space="preserve"> de m’aider à comprendre certains concepts ou me conseiller une solution adaptée tout en </w:t>
+      </w:r>
+      <w:r>
+        <w:t>l</w:t>
+      </w:r>
+      <w:r>
+        <w:t>’</w:t>
+      </w:r>
+      <w:r>
+        <w:t>expliquant.</w:t>
       </w:r>
     </w:p>
     <w:p>
       <w:pPr>
         <w:pStyle w:val="Titre1"/>
       </w:pPr>
-      <w:bookmarkStart w:id="33" w:name="_Toc165969653"/>
-      <w:bookmarkStart w:id="34" w:name="_Toc244079164"/>
+      <w:bookmarkStart w:id="34" w:name="_Toc165969653"/>
+      <w:bookmarkStart w:id="35" w:name="_Toc244164431"/>
       <w:r>
         <w:t>Conclusion</w:t>
       </w:r>
-      <w:bookmarkEnd w:id="33"/>
       <w:bookmarkEnd w:id="34"/>
+      <w:bookmarkEnd w:id="35"/>
     </w:p>
     <w:p>
       <w:pPr>
         <w:pStyle w:val="Titre2"/>
       </w:pPr>
-      <w:bookmarkStart w:id="35" w:name="_Toc165969655"/>
-      <w:bookmarkStart w:id="36" w:name="_Toc244079165"/>
+      <w:bookmarkStart w:id="36" w:name="_Toc165969655"/>
+      <w:bookmarkStart w:id="37" w:name="_Toc244164432"/>
       <w:r>
         <w:t>Bilan de la planification</w:t>
       </w:r>
-      <w:bookmarkEnd w:id="35"/>
       <w:bookmarkEnd w:id="36"/>
+      <w:bookmarkEnd w:id="37"/>
     </w:p>
     <w:p>
       <w:pPr>
         <w:pStyle w:val="Retraitcorpsdetexte"/>
       </w:pPr>
       <w:r>
-        <w:t xml:space="preserve">Ma planification initialise était surestimé, j’ai laissé 2 </w:t>
+        <w:t xml:space="preserve">Ma planification initiale était </w:t>
+      </w:r>
+      <w:proofErr w:type="gramStart"/>
+      <w:r>
+        <w:t>surestimé</w:t>
+      </w:r>
+      <w:proofErr w:type="gramEnd"/>
+      <w:r>
+        <w:t xml:space="preserve">, j’ai laissé 2 </w:t>
       </w:r>
       <w:r>
         <w:t>semaines</w:t>
       </w:r>
       <w:r>
-        <w:t xml:space="preserve"> pour l’intégration de Scottplot, mais apparemment c’est beaucoup plus simple que je pensais, et a pris beaucoup moins de temps.</w:t>
+        <w:t xml:space="preserve"> pour l’intégration de </w:t>
+      </w:r>
+      <w:proofErr w:type="spellStart"/>
+      <w:r>
+        <w:t>Scottplot</w:t>
+      </w:r>
+      <w:proofErr w:type="spellEnd"/>
+      <w:r>
+        <w:t>, mais apparemment c’est beaucoup plus simple que je pensais, et a pris beaucoup moins de temps.</w:t>
       </w:r>
     </w:p>
     <w:p>
@@ -5886,235 +7710,312 @@
       <w:pPr>
         <w:pStyle w:val="Titre2"/>
       </w:pPr>
-      <w:bookmarkStart w:id="37" w:name="_Toc165969656"/>
-      <w:bookmarkStart w:id="38" w:name="_Toc244079166"/>
+      <w:bookmarkStart w:id="38" w:name="_Toc165969656"/>
+      <w:bookmarkStart w:id="39" w:name="_Toc244164433"/>
       <w:r>
         <w:t xml:space="preserve">Bilan </w:t>
       </w:r>
       <w:r>
-        <w:t>des users stories</w:t>
+        <w:t xml:space="preserve">des </w:t>
+      </w:r>
+      <w:proofErr w:type="spellStart"/>
+      <w:r>
+        <w:t>users</w:t>
+      </w:r>
+      <w:proofErr w:type="spellEnd"/>
+      <w:r>
+        <w:t xml:space="preserve"> stories</w:t>
+      </w:r>
+      <w:bookmarkEnd w:id="39"/>
+    </w:p>
+    <w:p>
+      <w:pPr>
+        <w:pStyle w:val="Retraitcorpsdetexte"/>
+      </w:pPr>
+      <w:r>
+        <w:t xml:space="preserve">Dans GitHub </w:t>
+      </w:r>
+      <w:proofErr w:type="spellStart"/>
+      <w:r>
+        <w:t>Projects</w:t>
+      </w:r>
+      <w:proofErr w:type="spellEnd"/>
+      <w:r>
+        <w:t xml:space="preserve">, j’ai défini plusieurs User Stories pour structurer le développement de l'application. La majorité d'entre elles ont été </w:t>
+      </w:r>
+      <w:r>
+        <w:t>faites</w:t>
+      </w:r>
+      <w:r>
+        <w:t xml:space="preserve"> avec succès, tandis que certaines ont dû être abandonnées ou adaptées, principalement en raison de contraintes de temps et de pertinence technique.</w:t>
+      </w:r>
+    </w:p>
+    <w:p>
+      <w:pPr>
+        <w:pStyle w:val="Retraitcorpsdetexte"/>
+      </w:pPr>
+    </w:p>
+    <w:p>
+      <w:pPr>
+        <w:pStyle w:val="Retraitcorpsdetexte"/>
+      </w:pPr>
+      <w:r>
+        <w:t>User Stories réalisées</w:t>
+      </w:r>
+      <w:r>
+        <w:t> :</w:t>
+      </w:r>
+    </w:p>
+    <w:p>
+      <w:pPr>
+        <w:pStyle w:val="Retraitcorpsdetexte"/>
+      </w:pPr>
+    </w:p>
+    <w:p>
+      <w:pPr>
+        <w:pStyle w:val="Retraitcorpsdetexte"/>
+      </w:pPr>
+      <w:r>
+        <w:t>US #1 — Ajout d'une nouvelle série depuis un fichier (partie CSV) -&gt; L'utilisateur peut importer un fichier .csv local depuis le menu. Les colonnes de date et de valeur sont automatiquement identifiées, et les données sont enregistrées en local puis tracées sur le graphique. En cas de fichier vide ou corrompu, un message d'erreur clair est affiché.</w:t>
+      </w:r>
+    </w:p>
+    <w:p>
+      <w:pPr>
+        <w:pStyle w:val="Retraitcorpsdetexte"/>
+      </w:pPr>
+      <w:r>
+        <w:t>US #2 — Masquer une série -</w:t>
+      </w:r>
+      <w:r>
+        <w:t>&gt; L’interface</w:t>
+      </w:r>
+      <w:r>
+        <w:t xml:space="preserve"> propose une liste à cocher qui permet d'afficher ou de masquer instantanément n'importe quelle courbe sans recharger les données.</w:t>
+      </w:r>
+    </w:p>
+    <w:p>
+      <w:pPr>
+        <w:pStyle w:val="Retraitcorpsdetexte"/>
+      </w:pPr>
+      <w:r>
+        <w:t xml:space="preserve">US #3 — Interaction avec le graphique -&gt; L'utilisateur peut zoomer fluidement avec la molette de la souris, faire défiler les axes en cliquer-glisser, et réinitialiser la vue d'ensemble en un clic grâce au bouton « </w:t>
+      </w:r>
+      <w:proofErr w:type="spellStart"/>
+      <w:r>
+        <w:t>Réinit</w:t>
+      </w:r>
+      <w:proofErr w:type="spellEnd"/>
+      <w:r>
+        <w:t xml:space="preserve">. </w:t>
+      </w:r>
+      <w:proofErr w:type="gramStart"/>
+      <w:r>
+        <w:t>le</w:t>
+      </w:r>
+      <w:proofErr w:type="gramEnd"/>
+      <w:r>
+        <w:t xml:space="preserve"> zoom ».</w:t>
+      </w:r>
+    </w:p>
+    <w:p>
+      <w:pPr>
+        <w:pStyle w:val="Retraitcorpsdetexte"/>
+      </w:pPr>
+    </w:p>
+    <w:p>
+      <w:pPr>
+        <w:pStyle w:val="Retraitcorpsdetexte"/>
+      </w:pPr>
+      <w:r>
+        <w:t>US #4 — Labels et légendes des graphiques -&gt; Chaque courbe tracée dispose d'une couleur distincte et contrastée. La légende s'actualise dynamiquement pour indiquer le nom de l'entreprise et la pastille de couleur associée.</w:t>
+      </w:r>
+    </w:p>
+    <w:p>
+      <w:pPr>
+        <w:pStyle w:val="Retraitcorpsdetexte"/>
+      </w:pPr>
+    </w:p>
+    <w:p>
+      <w:pPr>
+        <w:pStyle w:val="Retraitcorpsdetexte"/>
+      </w:pPr>
+      <w:r>
+        <w:t>US #7 — Exportation en PNG -&gt; Un bouton dédié permet d'enregistrer le graphique actif sous forme d'image au format .png via une boîte de dialogue standard pour choisir le dossier de destination.</w:t>
+      </w:r>
+    </w:p>
+    <w:p>
+      <w:pPr>
+        <w:ind w:left="708"/>
+        <w:rPr>
+          <w:rStyle w:val="lev"/>
+        </w:rPr>
+      </w:pPr>
+      <w:r>
+        <w:rPr>
+          <w:rStyle w:val="lev"/>
+        </w:rPr>
+        <w:t>Voici</w:t>
+      </w:r>
+      <w:r>
+        <w:rPr>
+          <w:rStyle w:val="lev"/>
+        </w:rPr>
+        <w:t xml:space="preserve"> </w:t>
+      </w:r>
+      <w:r>
+        <w:rPr>
+          <w:rStyle w:val="lev"/>
+        </w:rPr>
+        <w:t xml:space="preserve">les user stories ou </w:t>
+      </w:r>
+      <w:r>
+        <w:rPr>
+          <w:rStyle w:val="lev"/>
+        </w:rPr>
+        <w:t>certaines parties</w:t>
+      </w:r>
+      <w:r>
+        <w:rPr>
+          <w:rStyle w:val="lev"/>
+        </w:rPr>
+        <w:t xml:space="preserve"> d’entre </w:t>
+      </w:r>
+      <w:r>
+        <w:rPr>
+          <w:rStyle w:val="lev"/>
+        </w:rPr>
+        <w:t>elles</w:t>
+      </w:r>
+      <w:r>
+        <w:rPr>
+          <w:rStyle w:val="lev"/>
+        </w:rPr>
+        <w:t xml:space="preserve"> qui</w:t>
+      </w:r>
+      <w:r>
+        <w:rPr>
+          <w:rStyle w:val="lev"/>
+        </w:rPr>
+        <w:t xml:space="preserve"> ont été abandonnés à cause de manque de temps</w:t>
+      </w:r>
+      <w:r>
+        <w:rPr>
+          <w:rStyle w:val="lev"/>
+        </w:rPr>
+        <w:t xml:space="preserve"> ou qui avaient peu de valeur</w:t>
+      </w:r>
+      <w:r>
+        <w:rPr>
+          <w:rStyle w:val="lev"/>
+        </w:rPr>
+        <w:t>, tels que :</w:t>
+      </w:r>
+    </w:p>
+    <w:p>
+      <w:pPr>
+        <w:ind w:left="1134"/>
+      </w:pPr>
+    </w:p>
+    <w:p>
+      <w:pPr>
+        <w:ind w:left="1134"/>
+      </w:pPr>
+      <w:r>
+        <w:t xml:space="preserve">US #1 — Importation directe de </w:t>
+      </w:r>
+      <w:proofErr w:type="gramStart"/>
+      <w:r>
+        <w:t>fichiers .JSON</w:t>
+      </w:r>
+      <w:proofErr w:type="gramEnd"/>
+      <w:r>
+        <w:t xml:space="preserve"> externe</w:t>
+      </w:r>
+      <w:r>
+        <w:t xml:space="preserve"> -&gt; J’ai décidé de ne pas faire un </w:t>
+      </w:r>
+      <w:proofErr w:type="spellStart"/>
+      <w:r>
+        <w:t>parser</w:t>
+      </w:r>
+      <w:proofErr w:type="spellEnd"/>
+      <w:r>
+        <w:t xml:space="preserve"> pour les </w:t>
+      </w:r>
+      <w:proofErr w:type="gramStart"/>
+      <w:r>
+        <w:t>fichier .</w:t>
+      </w:r>
+      <w:proofErr w:type="spellStart"/>
+      <w:r>
+        <w:t>json</w:t>
+      </w:r>
+      <w:proofErr w:type="spellEnd"/>
+      <w:proofErr w:type="gramEnd"/>
+      <w:r>
+        <w:t>, parce que .csv serait le format le plus utilisé pour ce genre de données.</w:t>
+      </w:r>
+    </w:p>
+    <w:p>
+      <w:pPr>
+        <w:ind w:left="1134"/>
+      </w:pPr>
+    </w:p>
+    <w:p>
+      <w:pPr>
+        <w:ind w:left="1134"/>
+      </w:pPr>
+      <w:r>
+        <w:t>US #5 — Importation en direct via une API externe</w:t>
+      </w:r>
+      <w:r>
+        <w:t xml:space="preserve"> -</w:t>
+      </w:r>
+      <w:proofErr w:type="gramStart"/>
+      <w:r>
+        <w:t>&gt;  cette</w:t>
+      </w:r>
+      <w:proofErr w:type="gramEnd"/>
+      <w:r>
+        <w:t xml:space="preserve"> fonctionnalité a été complétement abandonnée dès le début, à cause de sa complexité.</w:t>
+      </w:r>
+    </w:p>
+    <w:p>
+      <w:pPr>
+        <w:ind w:left="1134"/>
+      </w:pPr>
+    </w:p>
+    <w:p>
+      <w:pPr>
+        <w:ind w:left="1134"/>
+      </w:pPr>
+      <w:r>
+        <w:t>US #6 — Saisie manuelle d'un nouveau point</w:t>
+      </w:r>
+      <w:r>
+        <w:t xml:space="preserve"> -&gt; cette user story a été abandonné </w:t>
+      </w:r>
+      <w:r>
+        <w:t>parce qu’elle n’apporte aucune valeur ajoutée pour l’utilisateur, et qu’elle n’était pas obligatoire dans le cahier des charges.</w:t>
+      </w:r>
+      <w:r>
+        <w:br/>
+      </w:r>
+    </w:p>
+    <w:p>
+      <w:pPr>
+        <w:pStyle w:val="Titre2"/>
+      </w:pPr>
+      <w:bookmarkStart w:id="40" w:name="_Toc244164434"/>
+      <w:r>
+        <w:lastRenderedPageBreak/>
+        <w:t xml:space="preserve">Bilan </w:t>
       </w:r>
       <w:bookmarkEnd w:id="38"/>
-    </w:p>
-    <w:p>
-      <w:pPr>
-        <w:pStyle w:val="Retraitcorpsdetexte"/>
-      </w:pPr>
-      <w:r>
-        <w:t>Dans GitHub Projects, j’ai défini plusieurs User Stories pour structurer le développement de l'application. La majorité d'entre elles ont été menées à terme avec succès, tandis que certaines ont dû être abandonnées ou adaptées, principalement en raison de contraintes de temps et de pertinence technique.</w:t>
-      </w:r>
-    </w:p>
-    <w:p>
-      <w:pPr>
-        <w:pStyle w:val="Retraitcorpsdetexte"/>
-      </w:pPr>
-    </w:p>
-    <w:p>
-      <w:pPr>
-        <w:pStyle w:val="Retraitcorpsdetexte"/>
-      </w:pPr>
-      <w:r>
-        <w:t>User Stories réalisées</w:t>
-      </w:r>
-      <w:r>
-        <w:t> :</w:t>
-      </w:r>
-    </w:p>
-    <w:p>
-      <w:pPr>
-        <w:pStyle w:val="Retraitcorpsdetexte"/>
-      </w:pPr>
-      <w:r>
-        <w:t>US #1 — Ajout d'une nouvelle série depuis un fichier (partie CSV)</w:t>
-      </w:r>
-      <w:r>
-        <w:t xml:space="preserve"> -&gt; </w:t>
-      </w:r>
-      <w:r>
-        <w:t>L'utilisateur peut importer un fichier .csv local depuis le menu. Les colonnes de date et de valeur sont automatiquement identifiées, et les données sont enregistrées en local puis tracées sur le graphique. En cas de fichier vide ou corrompu, un message d'erreur clair est affiché.</w:t>
-      </w:r>
-    </w:p>
-    <w:p>
-      <w:pPr>
-        <w:pStyle w:val="Retraitcorpsdetexte"/>
-      </w:pPr>
-      <w:r>
-        <w:t xml:space="preserve">US #2 — Masquer une </w:t>
-      </w:r>
-      <w:r>
-        <w:t>série -</w:t>
-      </w:r>
-      <w:r>
-        <w:t>&gt; L’interface</w:t>
-      </w:r>
-      <w:r>
-        <w:t xml:space="preserve"> propose une liste à cocher qui permet d'afficher ou de masquer instantanément n'importe quelle courbe sans recharger les données.</w:t>
-      </w:r>
-    </w:p>
-    <w:p>
-      <w:pPr>
-        <w:pStyle w:val="Retraitcorpsdetexte"/>
-      </w:pPr>
-      <w:r>
-        <w:lastRenderedPageBreak/>
-        <w:t xml:space="preserve">US #3 — Interaction avec le graphique </w:t>
-      </w:r>
-      <w:r>
-        <w:t xml:space="preserve">-&gt; </w:t>
-      </w:r>
-      <w:r>
-        <w:t>L'utilisateur peut zoomer fluidement avec la molette de la souris, faire défiler les axes en cliquer-glisser, et réinitialiser la vue d'ensemble en un clic grâce au bouton « Réinit. le zoom ».</w:t>
-      </w:r>
-    </w:p>
-    <w:p>
-      <w:pPr>
-        <w:pStyle w:val="Retraitcorpsdetexte"/>
-      </w:pPr>
-    </w:p>
-    <w:p>
-      <w:pPr>
-        <w:pStyle w:val="Retraitcorpsdetexte"/>
-      </w:pPr>
-      <w:r>
-        <w:t xml:space="preserve">US #4 — Labels et légendes des graphiques </w:t>
-      </w:r>
-      <w:r>
-        <w:t xml:space="preserve">-&gt; </w:t>
-      </w:r>
-      <w:r>
-        <w:t>Chaque courbe tracée dispose d'une couleur distincte et contrastée. La légende s'actualise dynamiquement pour indiquer le nom de l'entreprise et la pastille de couleur associée.</w:t>
-      </w:r>
-    </w:p>
-    <w:p>
-      <w:pPr>
-        <w:pStyle w:val="Retraitcorpsdetexte"/>
-      </w:pPr>
-    </w:p>
-    <w:p>
-      <w:pPr>
-        <w:pStyle w:val="Retraitcorpsdetexte"/>
-      </w:pPr>
-      <w:r>
-        <w:t xml:space="preserve">US #7 — Exportation en PNG </w:t>
-      </w:r>
-      <w:r>
-        <w:t xml:space="preserve">-&gt; </w:t>
-      </w:r>
-      <w:r>
-        <w:t>Un bouton dédié permet d'enregistrer le graphique actif sous forme d'image au format .png via une boîte de dialogue standard pour choisir le dossier de destination.</w:t>
-      </w:r>
-    </w:p>
-    <w:p>
-      <w:pPr>
-        <w:ind w:left="1134"/>
-        <w:rPr>
-          <w:rStyle w:val="lev"/>
-        </w:rPr>
-      </w:pPr>
-      <w:r>
-        <w:rPr>
-          <w:rStyle w:val="lev"/>
-        </w:rPr>
-        <w:t>Voici</w:t>
-      </w:r>
-      <w:r>
-        <w:rPr>
-          <w:rStyle w:val="lev"/>
-        </w:rPr>
-        <w:t xml:space="preserve"> </w:t>
-      </w:r>
-      <w:r>
-        <w:rPr>
-          <w:rStyle w:val="lev"/>
-        </w:rPr>
-        <w:t>les user stories ou certains partie d’entre eux qui</w:t>
-      </w:r>
-      <w:r>
-        <w:rPr>
-          <w:rStyle w:val="lev"/>
-        </w:rPr>
-        <w:t xml:space="preserve"> ont été abandonnés à cause de manque de temps</w:t>
-      </w:r>
-      <w:r>
-        <w:rPr>
-          <w:rStyle w:val="lev"/>
-        </w:rPr>
-        <w:t xml:space="preserve"> ou qui avaient peu de valeur</w:t>
-      </w:r>
-      <w:r>
-        <w:rPr>
-          <w:rStyle w:val="lev"/>
-        </w:rPr>
-        <w:t>, tels que :</w:t>
-      </w:r>
-    </w:p>
-    <w:p>
-      <w:pPr>
-        <w:ind w:left="1134"/>
-      </w:pPr>
-    </w:p>
-    <w:p>
-      <w:pPr>
-        <w:ind w:left="1134"/>
-      </w:pPr>
-      <w:r>
-        <w:t>US #1 — Importation directe de fichiers .JSON externe</w:t>
-      </w:r>
-      <w:r>
-        <w:t xml:space="preserve"> -&gt; J’ai décidé de ne pas faire un parser pour les fichier .json, parce que .csv serait le format le plus utilisé pour ce genre de données.</w:t>
-      </w:r>
-    </w:p>
-    <w:p>
-      <w:pPr>
-        <w:ind w:left="1134"/>
-      </w:pPr>
-    </w:p>
-    <w:p>
-      <w:pPr>
-        <w:ind w:left="1134"/>
-      </w:pPr>
-      <w:r>
-        <w:t>US #5 — Importation en direct via une API externe</w:t>
-      </w:r>
-      <w:r>
-        <w:t xml:space="preserve"> -&gt;  cette fonctionnalité a été complétement abandonnée dès le début, à cause de sa complexité.</w:t>
-      </w:r>
-    </w:p>
-    <w:p>
-      <w:pPr>
-        <w:ind w:left="1134"/>
-      </w:pPr>
-    </w:p>
-    <w:p>
-      <w:pPr>
-        <w:ind w:left="1134"/>
-      </w:pPr>
-      <w:r>
-        <w:t>US #6 — Saisie manuelle d'un nouveau point</w:t>
-      </w:r>
-      <w:r>
-        <w:t xml:space="preserve"> -&gt; cette user story a été abandonné </w:t>
-      </w:r>
-      <w:r>
-        <w:t>parce qu’elle n’apporte aucune valeur ajoutée pour l’utilisateur, et qu’elle n’était pas obligatoire dans le cahier des charges.</w:t>
-      </w:r>
-      <w:r>
-        <w:br/>
-      </w:r>
-    </w:p>
-    <w:p>
-      <w:pPr>
-        <w:pStyle w:val="Titre2"/>
-      </w:pPr>
-      <w:bookmarkStart w:id="39" w:name="_Toc244079167"/>
-      <w:r>
-        <w:t xml:space="preserve">Bilan </w:t>
-      </w:r>
-      <w:bookmarkEnd w:id="37"/>
       <w:r>
         <w:t>des problèmes</w:t>
       </w:r>
-      <w:bookmarkEnd w:id="39"/>
+      <w:bookmarkEnd w:id="40"/>
     </w:p>
     <w:p>
       <w:pPr>
@@ -6125,7 +8026,13 @@
         </w:numPr>
       </w:pPr>
       <w:r>
-        <w:t>C’était problématique de trouver une bonne source pour les séries de données, et j’ai dû passer quelques heures à trouver une solution.</w:t>
+        <w:t xml:space="preserve">C’était problématique de trouver une bonne source pour les séries de données, et j’ai dû passer quelques </w:t>
+      </w:r>
+      <w:r>
+        <w:t>périodes</w:t>
+      </w:r>
+      <w:r>
+        <w:t xml:space="preserve"> à trouver une solution.</w:t>
       </w:r>
     </w:p>
     <w:p>
@@ -6142,18 +8049,34 @@
         </w:numPr>
       </w:pPr>
       <w:r>
-        <w:t>C’était aussi un peu compliqué à comprendre comment fonctionne WinForms, lors de placement des éléments (boutons, sections, etc) sur la fenêtre et de faire de gérer les différentes résolutions d’écran.</w:t>
+        <w:t xml:space="preserve">C’était aussi un peu compliqué à comprendre comment fonctionne </w:t>
+      </w:r>
+      <w:proofErr w:type="spellStart"/>
+      <w:r>
+        <w:t>WinForms</w:t>
+      </w:r>
+      <w:proofErr w:type="spellEnd"/>
+      <w:r>
+        <w:t xml:space="preserve">, lors de placement des éléments (boutons, sections, </w:t>
+      </w:r>
+      <w:proofErr w:type="spellStart"/>
+      <w:r>
+        <w:t>etc</w:t>
+      </w:r>
+      <w:proofErr w:type="spellEnd"/>
+      <w:r>
+        <w:t>) sur la fenêtre et de gérer les différentes résolutions d’écran.</w:t>
       </w:r>
     </w:p>
     <w:p>
       <w:pPr>
         <w:pStyle w:val="Titre2"/>
       </w:pPr>
-      <w:bookmarkStart w:id="40" w:name="_Toc244079168"/>
+      <w:bookmarkStart w:id="41" w:name="_Toc244164435"/>
       <w:r>
         <w:t>Bilan du projet</w:t>
       </w:r>
-      <w:bookmarkEnd w:id="40"/>
+      <w:bookmarkEnd w:id="41"/>
     </w:p>
     <w:p>
       <w:pPr>
@@ -6161,25 +8084,23 @@
         <w:ind w:left="708"/>
       </w:pPr>
       <w:r>
-        <w:t xml:space="preserve">Ce projet m'a permis de </w:t>
-      </w:r>
-      <w:r>
-        <w:t>monter</w:t>
-      </w:r>
-      <w:r>
-        <w:t xml:space="preserve"> mes compétences en C#, particulièrement dans l'usage de</w:t>
-      </w:r>
-      <w:r>
-        <w:t xml:space="preserve"> </w:t>
-      </w:r>
-      <w:r>
-        <w:t xml:space="preserve">LINQ et la mise en place de tests unitaires avec MSTest. L'intégration de ScottPlot </w:t>
-      </w:r>
-      <w:r>
-        <w:t>a été effectué et m’a permis d’obtenir de l’expérience avec ce genre de librairies</w:t>
-      </w:r>
-      <w:r>
-        <w:t>.</w:t>
+        <w:t xml:space="preserve">Ce projet m'a permis de monter mes compétences en C#, particulièrement dans l'usage de LINQ et la mise en place de tests unitaires avec </w:t>
+      </w:r>
+      <w:proofErr w:type="spellStart"/>
+      <w:r>
+        <w:t>MSTest</w:t>
+      </w:r>
+      <w:proofErr w:type="spellEnd"/>
+      <w:r>
+        <w:t xml:space="preserve">. L'intégration de </w:t>
+      </w:r>
+      <w:proofErr w:type="spellStart"/>
+      <w:r>
+        <w:t>ScottPlot</w:t>
+      </w:r>
+      <w:proofErr w:type="spellEnd"/>
+      <w:r>
+        <w:t xml:space="preserve"> a été effectué et m’a permis d’obtenir de l’expérience avec ce genre de librairies.</w:t>
       </w:r>
     </w:p>
     <w:p>
@@ -6218,11 +8139,11 @@
       <w:pPr>
         <w:pStyle w:val="Titre1"/>
       </w:pPr>
-      <w:bookmarkStart w:id="41" w:name="_Toc244079169"/>
+      <w:bookmarkStart w:id="42" w:name="_Toc244164436"/>
       <w:r>
         <w:t>Webographie</w:t>
       </w:r>
-      <w:bookmarkEnd w:id="41"/>
+      <w:bookmarkEnd w:id="42"/>
       <w:r>
         <w:t xml:space="preserve"> </w:t>
       </w:r>
@@ -6231,8 +8152,29 @@
       <w:pPr>
         <w:pStyle w:val="Corpsdetexte"/>
       </w:pPr>
-      <w:r>
-        <w:t xml:space="preserve">Scottplot – Guide officiel de ScottPlot pour WinForms - </w:t>
+      <w:proofErr w:type="spellStart"/>
+      <w:r>
+        <w:t>Scottplot</w:t>
+      </w:r>
+      <w:proofErr w:type="spellEnd"/>
+      <w:r>
+        <w:t xml:space="preserve"> – Guide officiel de </w:t>
+      </w:r>
+      <w:proofErr w:type="spellStart"/>
+      <w:r>
+        <w:t>ScottPlot</w:t>
+      </w:r>
+      <w:proofErr w:type="spellEnd"/>
+      <w:r>
+        <w:t xml:space="preserve"> pour </w:t>
+      </w:r>
+      <w:proofErr w:type="spellStart"/>
+      <w:r>
+        <w:t>WinForms</w:t>
+      </w:r>
+      <w:proofErr w:type="spellEnd"/>
+      <w:r>
+        <w:t xml:space="preserve"> - </w:t>
       </w:r>
       <w:r>
         <w:t>https://scottplot.net/cookbook/5.0/</w:t>
@@ -6257,15 +8199,23 @@
         <w:t>Yahoo Finance 2</w:t>
       </w:r>
       <w:r>
-        <w:t xml:space="preserve"> – bibliothèque de scraping de données historiques de la bourse - </w:t>
+        <w:t xml:space="preserve"> – bibliothèque de </w:t>
+      </w:r>
+      <w:proofErr w:type="spellStart"/>
+      <w:r>
+        <w:t>scraping</w:t>
+      </w:r>
+      <w:proofErr w:type="spellEnd"/>
+      <w:r>
+        <w:t xml:space="preserve"> de données historiques de la bourse - </w:t>
       </w:r>
       <w:r>
         <w:t>https://github.com/gadicc/yahoo-finance2/tree/dev</w:t>
       </w:r>
     </w:p>
     <w:sectPr>
-      <w:headerReference w:type="default" r:id="rId20"/>
-      <w:footerReference w:type="default" r:id="rId21"/>
+      <w:headerReference w:type="default" r:id="rId21"/>
+      <w:footerReference w:type="default" r:id="rId22"/>
       <w:pgSz w:w="11906" w:h="16838" w:code="9"/>
       <w:pgMar w:top="1418" w:right="1418" w:bottom="1418" w:left="1418" w:header="709" w:footer="709" w:gutter="0"/>
       <w:cols w:space="708"/>
@@ -6688,12 +8638,21 @@
               <w:szCs w:val="16"/>
             </w:rPr>
           </w:pPr>
+          <w:proofErr w:type="gramStart"/>
           <w:r>
             <w:rPr>
               <w:rFonts w:cs="Arial"/>
               <w:szCs w:val="16"/>
             </w:rPr>
-            <w:t xml:space="preserve">Version: </w:t>
+            <w:t>Version:</w:t>
+          </w:r>
+          <w:proofErr w:type="gramEnd"/>
+          <w:r>
+            <w:rPr>
+              <w:rFonts w:cs="Arial"/>
+              <w:szCs w:val="16"/>
+            </w:rPr>
+            <w:t xml:space="preserve"> </w:t>
           </w:r>
           <w:fldSimple w:instr=" REVNUM   \* MERGEFORMAT ">
             <w:r>
@@ -6739,7 +8698,7 @@
               <w:noProof/>
               <w:szCs w:val="16"/>
             </w:rPr>
-            <w:t>26.10.2026 11:23</w:t>
+            <w:t>28.10.2026 11:26</w:t>
           </w:r>
           <w:r>
             <w:rPr>
@@ -6951,7 +8910,7 @@
         <v:path o:extrusionok="f" gradientshapeok="t" o:connecttype="rect"/>
         <o:lock v:ext="edit" aspectratio="t"/>
       </v:shapetype>
-      <v:shape id="_x0000_i1025" type="#_x0000_t75" style="width:11.25pt;height:11.25pt" o:bullet="t">
+      <v:shape id="_x0000_i1025" type="#_x0000_t75" style="width:11.3pt;height:11.3pt" o:bullet="t">
         <v:imagedata r:id="rId1" o:title="BD10263_"/>
       </v:shape>
     </w:pict>
@@ -9390,6 +11349,7 @@
   <w:style w:type="character" w:default="1" w:styleId="Policepardfaut">
     <w:name w:val="Default Paragraph Font"/>
     <w:uiPriority w:val="1"/>
+    <w:semiHidden/>
     <w:unhideWhenUsed/>
   </w:style>
   <w:style w:type="table" w:default="1" w:styleId="TableauNormal">
@@ -10221,12 +12181,7 @@
 </file>
 
 <file path=customXml/item2.xml><?xml version="1.0" encoding="utf-8"?>
-<?mso-contentType ?>
-<FormTemplates xmlns="http://schemas.microsoft.com/sharepoint/v3/contenttype/forms">
-  <Display>DocumentLibraryForm</Display>
-  <Edit>DocumentLibraryForm</Edit>
-  <New>DocumentLibraryForm</New>
-</FormTemplates>
+<b:Sources xmlns:b="http://schemas.openxmlformats.org/officeDocument/2006/bibliography" xmlns="http://schemas.openxmlformats.org/officeDocument/2006/bibliography" SelectedStyle="\APA.XSL" StyleName="APA"/>
 </file>
 
 <file path=customXml/item3.xml><?xml version="1.0" encoding="utf-8"?>
@@ -10473,7 +12428,12 @@
 </file>
 
 <file path=customXml/item4.xml><?xml version="1.0" encoding="utf-8"?>
-<b:Sources xmlns:b="http://schemas.openxmlformats.org/officeDocument/2006/bibliography" xmlns="http://schemas.openxmlformats.org/officeDocument/2006/bibliography" SelectedStyle="\APA.XSL" StyleName="APA"/>
+<?mso-contentType ?>
+<FormTemplates xmlns="http://schemas.microsoft.com/sharepoint/v3/contenttype/forms">
+  <Display>DocumentLibraryForm</Display>
+  <Edit>DocumentLibraryForm</Edit>
+  <New>DocumentLibraryForm</New>
+</FormTemplates>
 </file>
 
 <file path=customXml/itemProps1.xml><?xml version="1.0" encoding="utf-8"?>
@@ -10488,9 +12448,9 @@
 </file>
 
 <file path=customXml/itemProps2.xml><?xml version="1.0" encoding="utf-8"?>
-<ds:datastoreItem xmlns:ds="http://schemas.openxmlformats.org/officeDocument/2006/customXml" ds:itemID="{5E865F57-6285-4B13-9F81-ABD3A2DB1ADD}">
+<ds:datastoreItem xmlns:ds="http://schemas.openxmlformats.org/officeDocument/2006/customXml" ds:itemID="{CC7784B4-F310-4DC4-8DFD-79BD564D2FFE}">
   <ds:schemaRefs>
-    <ds:schemaRef ds:uri="http://schemas.microsoft.com/sharepoint/v3/contenttype/forms"/>
+    <ds:schemaRef ds:uri="http://schemas.openxmlformats.org/officeDocument/2006/bibliography"/>
   </ds:schemaRefs>
 </ds:datastoreItem>
 </file>
@@ -10515,9 +12475,9 @@
 </file>
 
 <file path=customXml/itemProps4.xml><?xml version="1.0" encoding="utf-8"?>
-<ds:datastoreItem xmlns:ds="http://schemas.openxmlformats.org/officeDocument/2006/customXml" ds:itemID="{CC7784B4-F310-4DC4-8DFD-79BD564D2FFE}">
+<ds:datastoreItem xmlns:ds="http://schemas.openxmlformats.org/officeDocument/2006/customXml" ds:itemID="{5E865F57-6285-4B13-9F81-ABD3A2DB1ADD}">
   <ds:schemaRefs>
-    <ds:schemaRef ds:uri="http://schemas.openxmlformats.org/officeDocument/2006/bibliography"/>
+    <ds:schemaRef ds:uri="http://schemas.microsoft.com/sharepoint/v3/contenttype/forms"/>
   </ds:schemaRefs>
 </ds:datastoreItem>
 </file>
</xml_diff>